<commit_message>
Produkt-Kapitel an Wettbewerbsanalyse angeglichen (Frauenfußball-Positionierung, Stil, Quellen)
</commit_message>
<xml_diff>
--- a/BetterSquad_Businessplan_3_Produkt.docx
+++ b/BetterSquad_Businessplan_3_Produkt.docx
@@ -3,1313 +3,520 @@
 <w:document xmlns:wpc="http://schemas.microsoft.com/office/word/2010/wordprocessingCanvas" xmlns:mo="http://schemas.microsoft.com/office/mac/office/2008/main" xmlns:mc="http://schemas.openxmlformats.org/markup-compatibility/2006" xmlns:mv="urn:schemas-microsoft-com:mac:vml" xmlns:o="urn:schemas-microsoft-com:office:office" xmlns:r="http://schemas.openxmlformats.org/officeDocument/2006/relationships" xmlns:m="http://schemas.openxmlformats.org/officeDocument/2006/math" xmlns:v="urn:schemas-microsoft-com:vml" xmlns:wp14="http://schemas.microsoft.com/office/word/2010/wordprocessingDrawing" xmlns:wp="http://schemas.openxmlformats.org/drawingml/2006/wordprocessingDrawing" xmlns:w10="urn:schemas-microsoft-com:office:word" xmlns:w="http://schemas.openxmlformats.org/wordprocessingml/2006/main" xmlns:w14="http://schemas.microsoft.com/office/word/2010/wordml" xmlns:wpg="http://schemas.microsoft.com/office/word/2010/wordprocessingGroup" xmlns:wpi="http://schemas.microsoft.com/office/word/2010/wordprocessingInk" xmlns:wne="http://schemas.microsoft.com/office/word/2006/wordml" xmlns:wps="http://schemas.microsoft.com/office/word/2010/wordprocessingShape" mc:Ignorable="w14 wp14">
   <w:body>
     <w:p>
+      <w:r>
+        <w:rPr>
+          <w:b/>
+          <w:sz w:val="30"/>
+        </w:rPr>
+        <w:t>Produkt / Dienstleistung</w:t>
+      </w:r>
+    </w:p>
+    <w:p>
       <w:pPr>
-        <w:jc w:val="left"/>
+        <w:keepNext/>
+        <w:spacing w:before="200" w:after="80"/>
+        <w:jc w:val="both"/>
       </w:pPr>
       <w:r>
         <w:rPr>
           <w:b/>
-          <w:color w:val="0E965A"/>
-          <w:sz w:val="56"/>
         </w:rPr>
-        <w:t>BetterSquad</w:t>
-      </w:r>
-      <w:r>
-        <w:rPr>
-          <w:color w:val="555F6E"/>
-          <w:sz w:val="32"/>
-        </w:rPr>
-        <w:t xml:space="preserve">  |  Businessplan</w:t>
-      </w:r>
-    </w:p>
-    <w:p>
-      <w:r>
-        <w:rPr>
-          <w:i/>
-          <w:color w:val="555F6E"/>
-          <w:sz w:val="24"/>
-        </w:rPr>
-        <w:t>Investiere in deinen Kader. Nicht in einzelne Spieler.</w:t>
-      </w:r>
-    </w:p>
-    <w:p>
-      <w:r>
-        <w:rPr>
-          <w:i w:val="0"/>
-          <w:color w:val="555F6E"/>
-          <w:sz w:val="20"/>
-        </w:rPr>
-        <w:t>WiSo Köln · Bachelorseminar · Wintersemester 2024/25</w:t>
-      </w:r>
-    </w:p>
-    <w:p/>
-    <w:p>
-      <w:pPr>
-        <w:pStyle w:val="Heading1"/>
-        <w:spacing w:before="320" w:after="160"/>
-      </w:pPr>
-      <w:r>
-        <w:rPr>
-          <w:b/>
-          <w:color w:val="0E965A"/>
-          <w:sz w:val="40"/>
-        </w:rPr>
-        <w:t>3  Produkt / Dienstleistung</w:t>
-      </w:r>
-    </w:p>
-    <w:p>
-      <w:r>
-        <w:rPr>
-          <w:i w:val="0"/>
-          <w:sz w:val="22"/>
-        </w:rPr>
-        <w:t>Dieses Kapitel beschreibt das Leistungsangebot von BetterSquad entlang der beiden untrennbaren Bausteine Hardware und Software. BetterSquad ist die erste integrierte GPS- und Recovery-Plattform, die professionelle Bundesliga-Methodik der Belastungssteuerung für den Amateur- und Nachwuchsfußball verfügbar macht – als schlüsselfertiges Komplettsystem aus tragbarer Sensorik und cloudbasierter Analysesoftware.</w:t>
+        <w:t>Produktüberblick und Wertversprechen</w:t>
       </w:r>
     </w:p>
     <w:p>
       <w:pPr>
-        <w:pStyle w:val="Heading2"/>
-        <w:spacing w:before="240" w:after="80"/>
+        <w:jc w:val="both"/>
       </w:pPr>
       <w:r>
-        <w:rPr>
-          <w:b/>
-          <w:color w:val="0A0F1A"/>
-          <w:sz w:val="28"/>
-        </w:rPr>
-        <w:t>3.1  Produktüberblick</w:t>
+        <w:t>BetterSquad ist ein integriertes Belastungssteuerungs-System für den Amateur- und Semi-Pro-Frauenfußball im DACH-Raum. Das Produkt verbindet vereinseigene Sensor-Hardware im Pool-Modell mit einer Software-Plattform, die rohe Mess- und Befindlichkeitsdaten nicht als Performance-Dashboard ausgibt, sondern zu einer konkreten, individuell auf die Spielerin kalibrierten Trainingsempfehlung verdichtet. Der inhaltliche Kern ist damit kein Tracking-Gadget, sondern ein female-informed Decision Layer: eine Entscheidungsschicht, die die äußere Belastung (GPS), die innere Belastung (Herzfrequenz und HRV) und das subjektive Befinden (Hooper-Index) auf Basis individueller Baselines jeder Spielerin auswertet.</w:t>
       </w:r>
     </w:p>
     <w:p>
+      <w:pPr>
+        <w:jc w:val="both"/>
+      </w:pPr>
       <w:r>
-        <w:rPr>
-          <w:i w:val="0"/>
-          <w:sz w:val="22"/>
-        </w:rPr>
-        <w:t>BetterSquad kombiniert die objektive Messung der äußeren Belastung (GPS-Tracking) und der inneren Belastung (Herzfrequenz / HRV) mit der subjektiven Befindlichkeit der Spieler (Hooper-Index). Aus diesen drei Datenquellen errechnet die Plattform die Acute:Chronic Workload Ratio (ACWR) und übersetzt sie in eine sofort verständliche Ampel-Logik (Grün / Gelb / Rot). Trainerinnen und Trainer erhalten damit ohne sportwissenschaftliches Personal vor Ort eine fundierte, individuelle Entscheidungsgrundlage für jede Trainingseinheit.</w:t>
+        <w:t>Das Leistungsangebot adressiert eine strukturelle Lücke: Etablierte Hardware-Anbieter richten sich mit Pro-Spieler:in-Preislogik und überwiegend aus Männermessungen abgeleiteten Referenzwerten an Elite- und Profistrukturen, während female-spezifische Software-Plattformen zwar die Frauenphysiologie adressieren, aber weder Vereins-Hardware noch eine objektive, belastungsbasierte Steuerung bieten. BetterSquad besetzt genau die Schnittstelle beider Welten – zu einem Preis, der für eine Regionalliga- oder Oberliga-Frauenabteilung tragbar ist (ab 219 € pro Monat statt vier- bis fünfstelliger Jahresaufwände bei Pro-Gerät-Modellen).</w:t>
       </w:r>
     </w:p>
     <w:p>
+      <w:pPr>
+        <w:jc w:val="both"/>
+      </w:pPr>
       <w:r>
         <w:rPr>
           <w:b w:val="0"/>
         </w:rPr>
-        <w:t xml:space="preserve">Das Angebot besteht aus drei aufeinander abgestimmten Komponenten: </w:t>
+        <w:t xml:space="preserve">Das Produkt besteht aus drei aufeinander abgestimmten Bausteinen: </w:t>
       </w:r>
       <w:r>
         <w:rPr>
           <w:b/>
         </w:rPr>
-        <w:t xml:space="preserve">(1) tragbare Hardware </w:t>
+        <w:t xml:space="preserve">(1) einer vereinseigenen Hardware </w:t>
       </w:r>
       <w:r>
         <w:rPr>
           <w:b w:val="0"/>
         </w:rPr>
-        <w:t xml:space="preserve">im Vereinspool, </w:t>
+        <w:t xml:space="preserve">im geteilten Sensor-Pool, </w:t>
       </w:r>
       <w:r>
         <w:rPr>
           <w:b/>
         </w:rPr>
-        <w:t xml:space="preserve">(2) eine Software-Plattform </w:t>
+        <w:t xml:space="preserve">(2) einer Software-Plattform </w:t>
       </w:r>
       <w:r>
         <w:rPr>
           <w:b w:val="0"/>
         </w:rPr>
-        <w:t xml:space="preserve">aus Trainer-Dashboard und Spieler-App sowie </w:t>
+        <w:t xml:space="preserve">aus Trainer:innen-Dashboard und Spieler:innen-App sowie </w:t>
       </w:r>
       <w:r>
         <w:rPr>
           <w:b/>
         </w:rPr>
-        <w:t xml:space="preserve">(3) eine analytische Engine </w:t>
+        <w:t xml:space="preserve">(3) einem female-informed Decision Layer </w:t>
       </w:r>
       <w:r>
         <w:rPr>
           <w:b w:val="0"/>
         </w:rPr>
-        <w:t>mit KI-gestützten Trainingsempfehlungen.</w:t>
+        <w:t>mit datenschutzfreundlicher Architektur. Die folgenden Abschnitte beschreiben Hardware und Software entlang dieser Bausteine.</w:t>
       </w:r>
     </w:p>
-    <w:tbl>
-      <w:tblPr>
-        <w:tblW w:type="auto" w:w="0"/>
-        <w:jc w:val="center"/>
-        <w:tblLook w:firstColumn="1" w:firstRow="1" w:lastColumn="0" w:lastRow="0" w:noHBand="0" w:noVBand="1" w:val="04A0"/>
-      </w:tblPr>
-      <w:tblGrid>
-        <w:gridCol w:w="9406"/>
-      </w:tblGrid>
-      <w:tr>
-        <w:tc>
-          <w:tcPr>
-            <w:tcW w:type="dxa" w:w="9406"/>
-            <w:shd w:val="clear" w:color="auto" w:fill="ECFDF5"/>
-          </w:tcPr>
-          <w:p>
-            <w:r/>
-            <w:r>
-              <w:rPr>
-                <w:b/>
-                <w:color w:val="0E965A"/>
-                <w:sz w:val="22"/>
-              </w:rPr>
-              <w:t>Kernversprechen</w:t>
-            </w:r>
-          </w:p>
-          <w:p>
-            <w:r>
-              <w:rPr>
-                <w:sz w:val="21"/>
-              </w:rPr>
-              <w:t>Bundesliga-Methodik zum Amateur-Preis: 219 €/Monat statt rund 15.000 $/Jahr bei etablierten Profi-Anbietern – DSGVO-konform und mit Serverstandort in Deutschland.</w:t>
-            </w:r>
-          </w:p>
-        </w:tc>
-      </w:tr>
-    </w:tbl>
     <w:p>
       <w:pPr>
-        <w:pStyle w:val="Heading2"/>
-        <w:spacing w:before="240" w:after="80"/>
+        <w:keepNext/>
+        <w:spacing w:before="280" w:after="80"/>
+        <w:jc w:val="both"/>
       </w:pPr>
       <w:r>
         <w:rPr>
           <w:b/>
-          <w:color w:val="0A0F1A"/>
-          <w:sz w:val="28"/>
         </w:rPr>
-        <w:t>3.2  Hardware</w:t>
-      </w:r>
-    </w:p>
-    <w:p>
-      <w:r>
-        <w:rPr>
-          <w:i w:val="0"/>
-          <w:sz w:val="22"/>
-        </w:rPr>
-        <w:t>Die Hardware bildet die Datengrundlage des Systems. Bewusst setzt BetterSquad auf erprobte, kalibrierte Standardkomponenten statt auf teure Eigenentwicklungen. Das senkt Stückkosten und Ausfallrisiko, verkürzt die Time-to-Market und garantiert validierte Messqualität. Die Geräte werden nicht einzeln pro Spieler, sondern als geteilter Vereinspool bereitgestellt (Pool-Modell).</w:t>
+        <w:t>Hardware: vereinseigener Sensor-Pool</w:t>
       </w:r>
     </w:p>
     <w:p>
       <w:pPr>
-        <w:pStyle w:val="Heading3"/>
-        <w:spacing w:before="160" w:after="40"/>
+        <w:jc w:val="both"/>
+      </w:pPr>
+      <w:r>
+        <w:t>Die Hardware bildet die objektive Datengrundlage des Systems. Bewusst setzt BetterSquad auf erprobte, kalibrierte Standardkomponenten statt auf teure Eigenentwicklungen. Das senkt Stückkosten und Ausfallrisiko, verkürzt die Time-to-Market und sichert eine validierte Messqualität. Die Geräte werden nicht – wie im Pro-Spieler:in-Modell der etablierten Anbieter – einzeln pro Athletin beschafft, sondern der Frauenabteilung als geteilter Pool zur Verfügung gestellt. Eine typische Abteilung mit drei bis fünf Teams und 60 bis 80 Spielerinnen wird so mit einem überschaubaren Gerätebestand abgedeckt.</w:t>
+      </w:r>
+    </w:p>
+    <w:p>
+      <w:pPr>
+        <w:keepNext/>
+        <w:spacing w:before="160" w:after="80"/>
+        <w:jc w:val="both"/>
       </w:pPr>
       <w:r>
         <w:rPr>
           <w:b/>
-          <w:color w:val="0E965A"/>
-          <w:sz w:val="24"/>
         </w:rPr>
-        <w:t>3.2.1  GPS-Tracker (äußere Belastung)</w:t>
-      </w:r>
-    </w:p>
-    <w:p>
-      <w:r>
-        <w:rPr>
-          <w:i w:val="0"/>
-          <w:sz w:val="22"/>
-        </w:rPr>
-        <w:t>Der GPS-Tracker wird in einer leichten Trageweste zwischen den Schulterblättern getragen und erfasst die äußere Belastung in Echtzeit:</w:t>
+        <w:t>GPS-Tracker (äußere Belastung)</w:t>
       </w:r>
     </w:p>
     <w:p>
       <w:pPr>
-        <w:pStyle w:val="ListBullet"/>
+        <w:jc w:val="both"/>
+      </w:pPr>
+      <w:r>
+        <w:t>Der GPS-Tracker wird in einer leichten Trageweste zwischen den Schulterblättern getragen und erfasst die äußere Belastung in Echtzeit: zurückgelegte Distanz und Distanz in Hochintensitäts-Zonen, Anzahl der Sprints, Höchstgeschwindigkeit sowie Beschleunigungs- und Abbrems-Lasten. Aus diesen Rohdaten wird die externe Tageslast (Load) berechnet, die als Grundgröße in das ACWR-Modell einfließt.</w:t>
+      </w:r>
+    </w:p>
+    <w:p>
+      <w:pPr>
+        <w:keepNext/>
+        <w:spacing w:before="160" w:after="80"/>
+        <w:jc w:val="both"/>
       </w:pPr>
       <w:r>
         <w:rPr>
           <w:b/>
-          <w:color w:val="0E965A"/>
         </w:rPr>
-        <w:t xml:space="preserve">Laufleistung: </w:t>
-      </w:r>
-      <w:r>
-        <w:t>Zurückgelegte Distanz und Distanz in Hochintensitäts-Zonen</w:t>
+        <w:t>Polar-H10-Pulsgurte (innere Belastung und Recovery)</w:t>
       </w:r>
     </w:p>
     <w:p>
       <w:pPr>
-        <w:pStyle w:val="ListBullet"/>
+        <w:jc w:val="both"/>
+      </w:pPr>
+      <w:r>
+        <w:t>Der medizinisch validierte Brustgurt Polar H10 misst die innere Belastung und liefert die Datenbasis für das Recovery-Monitoring: die Herzfrequenz in Echtzeit zur Steuerung der Trainingsintensität sowie die Herzfrequenzvariabilität (HRV) als sensiblen Frühindikator der Regeneration. Über eine Trendanalyse lassen sich Überlastungstendenzen mehrere Tage früher erkennen, als sie sich in der reinen Leistung zeigen. Als etablierter Industriestandard mit hoher EKG-Genauigkeit reduziert der Polar H10 zugleich den Beschaffungs- und Wartungsaufwand.</w:t>
+      </w:r>
+    </w:p>
+    <w:p>
+      <w:pPr>
+        <w:keepNext/>
+        <w:spacing w:before="160" w:after="80"/>
+        <w:jc w:val="both"/>
       </w:pPr>
       <w:r>
         <w:rPr>
           <w:b/>
-          <w:color w:val="0E965A"/>
         </w:rPr>
-        <w:t xml:space="preserve">Sprints &amp; Speed: </w:t>
-      </w:r>
-      <w:r>
-        <w:t>Anzahl der Sprints sowie Höchstgeschwindigkeit (km/h)</w:t>
+        <w:t>Tracker-Dock und QR-Checkout</w:t>
       </w:r>
     </w:p>
     <w:p>
       <w:pPr>
-        <w:pStyle w:val="ListBullet"/>
+        <w:jc w:val="both"/>
+      </w:pPr>
+      <w:r>
+        <w:t>Die Geräte lagern und laden in einem zentralen Tracker-Dock. Vor dem Training scannt jede Spielerin über die App einen QR-Code am Dock und erhält automatisch einen freien Tracker und Pulsgurt zugewiesen. Das löst zwei zentrale Probleme des Amateurbetriebs: Es macht eine feste 1:1-Zuordnung überflüssig (Voraussetzung des Pool-Modells) und stellt die korrekte, verwechslungsfreie Datenzuordnung sicher, ohne dass Personal die Geräte manuell verteilen muss. Eine Live-Übersicht zeigt jederzeit, welche Geräte verfügbar, ausgegeben oder in Wartung sind.</w:t>
+      </w:r>
+    </w:p>
+    <w:p>
+      <w:pPr>
+        <w:keepNext/>
+        <w:spacing w:before="160" w:after="80"/>
+        <w:jc w:val="both"/>
       </w:pPr>
       <w:r>
         <w:rPr>
           <w:b/>
-          <w:color w:val="0E965A"/>
         </w:rPr>
-        <w:t xml:space="preserve">HI-Runs: </w:t>
-      </w:r>
-      <w:r>
-        <w:t>High-Intensity-Runs als Indikator azyklischer Belastung</w:t>
+        <w:t>Pool-Modell und Pakete</w:t>
       </w:r>
     </w:p>
     <w:p>
       <w:pPr>
-        <w:pStyle w:val="ListBullet"/>
+        <w:jc w:val="both"/>
+      </w:pPr>
+      <w:r>
+        <w:t>Eine Vereinslizenz deckt die gesamte Frauenabteilung ab; der Hardware-Umfang skaliert mit dem gewählten Paket. Das Einstiegspaket Starter umfasst 15 GPS-Tracker und 15 Polar-H10-Gurte für bis zu zwei Teams (219 € pro Monat), das Paket Pro 25 Geräte-Sets für bis zu vier Teams (349 € pro Monat) und das Paket Elite 35 Geräte-Sets für eine unbegrenzte Zahl an Teams (459 € pro Monat). Hinzu kommen Trageschutzwesten, Ersatzbänder und das Lade- und Checkout-Dock. Die Hardware wird über eine einmalige Anzahlung (2.200 bis 4.200 €) und die laufende Lizenz finanziert; sie verbleibt im Nutzungsrecht der Abteilung. Diese geteilte Nutzung ist nicht nur ein Preisvorteil, sondern erzeugt zugleich Wechselkosten: Konfiguration und individuelle Baselines der Spielerinnen entstehen über Monate und gingen bei einem Anbieterwechsel verloren.</w:t>
+      </w:r>
+    </w:p>
+    <w:p>
+      <w:pPr>
+        <w:keepNext/>
+        <w:spacing w:before="280" w:after="80"/>
+        <w:jc w:val="both"/>
       </w:pPr>
       <w:r>
         <w:rPr>
           <w:b/>
-          <w:color w:val="0E965A"/>
         </w:rPr>
-        <w:t xml:space="preserve">Acc/Dec: </w:t>
-      </w:r>
-      <w:r>
-        <w:t>Beschleunigungs- und Abbrems-Lasten zur Erkennung von Asymmetrien</w:t>
-      </w:r>
-    </w:p>
-    <w:p>
-      <w:r>
-        <w:rPr>
-          <w:i w:val="0"/>
-          <w:color w:val="555F6E"/>
-          <w:sz w:val="20"/>
-        </w:rPr>
-        <w:t>Aus diesen Rohdaten wird die externe Tageslast (Load) berechnet, die als Grundgröße in das ACWR-Modell einfließt.</w:t>
+        <w:t>Software: Decision Layer statt Rohdaten-Dashboard</w:t>
       </w:r>
     </w:p>
     <w:p>
       <w:pPr>
-        <w:pStyle w:val="Heading3"/>
-        <w:spacing w:before="160" w:after="40"/>
+        <w:jc w:val="both"/>
+      </w:pPr>
+      <w:r>
+        <w:t>Die Software ist das Wertschöpfungszentrum und der zentrale Differenzierungsfaktor. Während der direkte Wettbewerb vor allem Rohdaten- und Performance-Dashboards für sportwissenschaftliche Stäbe liefert, übersetzt BetterSquad die Daten in handlungsleitende Empfehlungen, die auch ohne Sportwissenschaftler:in vor Ort verständlich sind. Als Software-as-a-Service ist die Plattform für den Verein wartungsfrei und wird kontinuierlich weiterentwickelt. Sie besteht aus dem Trainer:innen-Dashboard, der Spieler:innen-App und der dahinterliegenden Analyse-Engine mit dem female-informed Decision Layer.</w:t>
+      </w:r>
+    </w:p>
+    <w:p>
+      <w:pPr>
+        <w:keepNext/>
+        <w:spacing w:before="160" w:after="80"/>
+        <w:jc w:val="both"/>
       </w:pPr>
       <w:r>
         <w:rPr>
           <w:b/>
-          <w:color w:val="0E965A"/>
-          <w:sz w:val="24"/>
         </w:rPr>
-        <w:t>3.2.2  Polar-H10-Pulsgurte (innere Belastung &amp; Recovery)</w:t>
-      </w:r>
-    </w:p>
-    <w:p>
-      <w:r>
-        <w:rPr>
-          <w:i w:val="0"/>
-          <w:sz w:val="22"/>
-        </w:rPr>
-        <w:t>Der medizinisch validierte Brustgurt Polar H10 misst die innere Belastung und liefert die Datenbasis für das Recovery-Monitoring:</w:t>
+        <w:t>Trainer:innen-Dashboard und Session Planner</w:t>
       </w:r>
     </w:p>
     <w:p>
       <w:pPr>
-        <w:pStyle w:val="ListBullet"/>
+        <w:jc w:val="both"/>
+      </w:pPr>
+      <w:r>
+        <w:t>Das Web-Dashboard ist die Kommandozentrale für das Funktionsteam. Eine Squad-Ampel zeigt je Spielerin auf einen Blick den Status (Grün / Gelb / Rot), ergänzt um den Verlauf der durchschnittlichen und maximalen Team-ACWR über 21 Tage und Live-Kennzahlen zur Zahl fitter, gefährdeter und Risiko-Spielerinnen. Eine Detailansicht je Spielerin bündelt Last-, HRV- und Hooper-Historie; ein Equipment-Monitor zeigt den Pool-Status. Der integrierte Session Planner überführt die Analyse unmittelbar in die Trainingsplanung: Er stellt eine Kaderverfügbarkeits-Matrix mit ACWR, Hooper-Score, Status und empfohlener individueller Intensität (etwa „Pause“, „Leicht −20 %“ oder „Voll“) bereit und lässt sich als Sessionplan exportieren.</w:t>
+      </w:r>
+    </w:p>
+    <w:p>
+      <w:pPr>
+        <w:keepNext/>
+        <w:spacing w:before="160" w:after="80"/>
+        <w:jc w:val="both"/>
       </w:pPr>
       <w:r>
         <w:rPr>
           <w:b/>
-          <w:color w:val="0E965A"/>
         </w:rPr>
-        <w:t xml:space="preserve">HR: </w:t>
-      </w:r>
-      <w:r>
-        <w:t>Herzfrequenz in Echtzeit zur Steuerung der Trainingsintensität</w:t>
+        <w:t>Spieler:innen-App</w:t>
       </w:r>
     </w:p>
     <w:p>
       <w:pPr>
-        <w:pStyle w:val="ListBullet"/>
+        <w:jc w:val="both"/>
+      </w:pPr>
+      <w:r>
+        <w:t>Die mobile App bindet die Athletin aktiv in den Steuerungskreislauf ein. Sie zeigt eine tägliche Readiness-Karte mit persönlicher ACWR und Hooper-Score, ermöglicht den Wellness-Check-in über die vier Dimensionen Schlaf, Muskelkater, Energie und Stimmung, steuert den QR-Equipment-Checkout mit geführter Geräteanlage und stellt persönliche Statistiken zu Distanz, Sprints, Höchstgeschwindigkeit und HRV-Trend bereit. Über die App erfolgt zudem die freiwillige Eingabe der Zyklusinformation – ausschließlich durch die Spielerin selbst.</w:t>
+      </w:r>
+    </w:p>
+    <w:p>
+      <w:pPr>
+        <w:keepNext/>
+        <w:spacing w:before="160" w:after="80"/>
+        <w:jc w:val="both"/>
       </w:pPr>
       <w:r>
         <w:rPr>
           <w:b/>
-          <w:color w:val="0E965A"/>
         </w:rPr>
-        <w:t xml:space="preserve">HRV: </w:t>
-      </w:r>
-      <w:r>
-        <w:t>Herzfrequenzvariabilität (HRV) als sensibler Frühindikator der Regeneration</w:t>
+        <w:t>Female-informed Decision Layer</w:t>
       </w:r>
     </w:p>
     <w:p>
       <w:pPr>
-        <w:pStyle w:val="ListBullet"/>
+        <w:jc w:val="both"/>
+      </w:pPr>
+      <w:r>
+        <w:t>Der Decision Layer ist das eigentliche Alleinstellungsmerkmal der Software. Die Analyse-Engine verarbeitet äußere Last, innere Last und subjektives Befinden zu einer priorisierten, individuellen Empfehlung. Grundlage ist die Acute:Chronic Workload Ratio aus 7-Tage-Akut- und 28-Tage-Chroniklast (Schwellen: über 1,3 erhöht, über 1,49 kritisch), eingebettet in eine individuelle Baseline jeder Spielerin – nicht in aus Männermessungen abgeleitete Referenzwerte. Genau diese individuelle, auf weibliche Physiologie kalibrierte Auswertung fehlt sowohl beim direkten als auch beim indirekten Wettbewerb.</w:t>
+      </w:r>
+    </w:p>
+    <w:p>
+      <w:pPr>
+        <w:jc w:val="both"/>
+      </w:pPr>
+      <w:r>
+        <w:t>Die freiwillige Zyklusangabe fließt dabei als ein Faktor unter mehreren in den individuellen Score ein und kontextualisiert insbesondere die Interpretation der HRV-Werte. Das Ergebnis ist für die Trainer:innen eine verständliche Ampel mit Begründungstext und einer konkreten Handlungsempfehlung je Spielerin und für das Gesamtteam (etwa „Intensität um 20 % reduzieren, Fokus Taktik und Regeneration“). Damit ersetzt die Software die Interpretationsleistung, die im Profibereich teures Fachpersonal erbringt.</w:t>
+      </w:r>
+    </w:p>
+    <w:p>
+      <w:pPr>
+        <w:keepNext/>
+        <w:spacing w:before="280" w:after="80"/>
+        <w:jc w:val="both"/>
       </w:pPr>
       <w:r>
         <w:rPr>
           <w:b/>
-          <w:color w:val="0E965A"/>
         </w:rPr>
-        <w:t xml:space="preserve">Recovery: </w:t>
-      </w:r>
-      <w:r>
-        <w:t>Trendanalyse über Tage, um Übertraining 5–10 Tage früher zu erkennen</w:t>
-      </w:r>
-    </w:p>
-    <w:p>
-      <w:r>
-        <w:rPr>
-          <w:i w:val="0"/>
-          <w:color w:val="555F6E"/>
-          <w:sz w:val="20"/>
-        </w:rPr>
-        <w:t>Der Polar H10 ist ein etablierter Industriestandard mit hoher EKG-Genauigkeit und Bluetooth-Konnektivität – das reduziert Beschaffungs- und Wartungsaufwand erheblich.</w:t>
+        <w:t>Datenschutz-Architektur: ein Belastungs-Tool mit Zykluskontext, keine Zyklus-App</w:t>
       </w:r>
     </w:p>
     <w:p>
       <w:pPr>
-        <w:pStyle w:val="Heading3"/>
-        <w:spacing w:before="160" w:after="40"/>
+        <w:jc w:val="both"/>
+      </w:pPr>
+      <w:r>
+        <w:t>Da BetterSquad besondere Kategorien personenbezogener Daten im Sinne des Art. 9 DSGVO (Gesundheitsdaten) verarbeitet, ist Datenschutz integraler Produktbestandteil und zugleich vertrieblicher Wettbewerbsvorteil. Die gesamte Verarbeitung erfolgt DSGVO-konform mit Serverstandort in Deutschland, verschlüsselter Übertragung und rollenbasiert getrennten Zugriffen für Trainer:innen und Spielerinnen.</w:t>
+      </w:r>
+    </w:p>
+    <w:p>
+      <w:pPr>
+        <w:jc w:val="both"/>
+      </w:pPr>
+      <w:r>
+        <w:t>Entscheidend ist die bewusst gegenläufige Architektur gegenüber zyklusbasierten Software-Plattformen, die Trainer:innen bei Einwilligung weitreichende Einsicht in Zyklusphase und Symptomhistorie der Athletinnen gewähren. Bei BetterSquad ist die freiwillige Zyklusangabe ausschließlich ein interner Score-Faktor der Spielerin und zu keinem Zeitpunkt für Trainer:innen sichtbar; diese sehen ausschließlich Ampel und Begründungstext. BetterSquad ist damit ausdrücklich keine Zyklus-App, sondern ein Belastungs-Tool mit Zykluskontext. Diese Trennung ist datenschutzrechtlich (Art. 9 DSGVO), akzeptanzpsychologisch (überwiegend männlicher Trainerstab im Amateurfußball) und positionierungsstrategisch ein wesentlicher Unterschied – und schützt zugleich die individuelle Baseline als zentralen Werttreiber.</w:t>
+      </w:r>
+    </w:p>
+    <w:p>
+      <w:pPr>
+        <w:keepNext/>
+        <w:spacing w:before="280" w:after="80"/>
+        <w:jc w:val="both"/>
       </w:pPr>
       <w:r>
         <w:rPr>
           <w:b/>
-          <w:color w:val="0E965A"/>
-          <w:sz w:val="24"/>
         </w:rPr>
-        <w:t>3.2.3  Tracker-Dock &amp; QR-Checkout</w:t>
-      </w:r>
-    </w:p>
-    <w:p>
-      <w:r>
-        <w:rPr>
-          <w:i w:val="0"/>
-          <w:sz w:val="22"/>
-        </w:rPr>
-        <w:t>Die Geräte lagern und laden in einem zentralen Tracker-Dock. Vor dem Training scannt jeder Spieler über die App einen QR-Code am Dock und bekommt automatisch einen freien Tracker sowie einen Pulsgurt zugewiesen. Das löst zwei zentrale Praxisprobleme des Amateurbetriebs: Es macht eine feste 1:1-Zuordnung überflüssig (Pool-Modell) und stellt die korrekte Datenzuordnung sicher, ohne dass Personal Geräte manuell verteilen muss.</w:t>
+        <w:t>Wissenschaftliche Fundierung</w:t>
       </w:r>
     </w:p>
     <w:p>
       <w:pPr>
-        <w:pStyle w:val="ListBullet"/>
+        <w:jc w:val="both"/>
+      </w:pPr>
+      <w:r>
+        <w:t>Alle Kennzahlen des Systems beruhen auf etablierten sportwissenschaftlichen Methoden; das grenzt BetterSquad von rein technikgetriebenen Tracking-Gadgets ab und schafft Glaubwürdigkeit gegenüber Vereinen und Verbänden. Die Belastungssteuerung folgt dem von Gabbett (2016) validierten ACWR-Modell zur Verletzungsprävention. Der Wellness-Check-in basiert auf der nach Saw et al. (2016) bestätigten Aussagekraft subjektiver Selbstauskünfte (Hooper-Index). Die HRV-gestützte Recovery-Analyse stützt sich auf Befunde zur Trainingsadaptation und Herzfrequenzvariabilität (Plews et al., 2013), und die geschlechtsspezifische Kalibrierung trägt der Evidenz zum Einfluss des Menstruationszyklus auf die Leistungsfähigkeit Rechnung (McNulty et al., 2020).</w:t>
+      </w:r>
+    </w:p>
+    <w:p>
+      <w:pPr>
+        <w:keepNext/>
+        <w:spacing w:before="280" w:after="80"/>
+        <w:jc w:val="both"/>
       </w:pPr>
       <w:r>
         <w:rPr>
           <w:b/>
-          <w:color w:val="0E965A"/>
         </w:rPr>
-        <w:t xml:space="preserve">Self-Checkout: </w:t>
-      </w:r>
-      <w:r>
-        <w:t>Automatische Zuweisung von Tracker- und Gurt-Nummer per QR-Scan</w:t>
+        <w:t>Kundennutzen und Alleinstellung</w:t>
       </w:r>
     </w:p>
     <w:p>
       <w:pPr>
-        <w:pStyle w:val="ListBullet"/>
+        <w:jc w:val="both"/>
+      </w:pPr>
+      <w:r>
+        <w:t>Der Kundennutzen ergibt sich aus dem Zusammenspiel der Bausteine und lässt sich entlang weniger struktureller Vorteile zusammenfassen:</w:t>
+      </w:r>
+    </w:p>
+    <w:p>
+      <w:pPr>
+        <w:pStyle w:val="ListParagraph"/>
+        <w:jc w:val="both"/>
       </w:pPr>
       <w:r>
         <w:rPr>
           <w:b/>
-          <w:color w:val="0E965A"/>
         </w:rPr>
-        <w:t xml:space="preserve">Pool-Transparenz: </w:t>
+        <w:t>Integration statt Insellösungen</w:t>
+        <w:br/>
       </w:r>
       <w:r>
-        <w:t>Live-Übersicht über verfügbare, ausgegebene und in Wartung befindliche Geräte</w:t>
+        <w:t>Äußere und innere Last sowie subjektives Befinden laufen in einer Plattform zusammen, statt auf getrennte Hardware-, Performance- und Wellness-Tools verteilt zu sein.</w:t>
       </w:r>
     </w:p>
     <w:p>
       <w:pPr>
-        <w:pStyle w:val="ListBullet"/>
+        <w:pStyle w:val="ListParagraph"/>
+        <w:jc w:val="both"/>
       </w:pPr>
       <w:r>
         <w:rPr>
           <w:b/>
-          <w:color w:val="0E965A"/>
         </w:rPr>
-        <w:t xml:space="preserve">Onboarding: </w:t>
+        <w:t>Bezahlbarkeit durch das Pool-Modell</w:t>
+        <w:br/>
       </w:r>
       <w:r>
-        <w:t>Geführte Schritt-für-Schritt-Anlage (Weste, Gurt befeuchten, Bluetooth prüfen)</w:t>
+        <w:t>Eine Vereinslizenz und ein geteilter Gerätepool decken die gesamte Frauenabteilung ab; die Pro-Gerät- bzw. Pro-Spieler:in-Logik des Wettbewerbs entfällt.</w:t>
       </w:r>
     </w:p>
     <w:p>
       <w:pPr>
-        <w:pStyle w:val="Heading3"/>
-        <w:spacing w:before="160" w:after="40"/>
+        <w:pStyle w:val="ListParagraph"/>
+        <w:jc w:val="both"/>
       </w:pPr>
       <w:r>
         <w:rPr>
           <w:b/>
-          <w:color w:val="0E965A"/>
-          <w:sz w:val="24"/>
         </w:rPr>
-        <w:t>3.2.4  Pool-Modell &amp; Lieferumfang</w:t>
+        <w:t>Female-informed Decision Layer</w:t>
+        <w:br/>
       </w:r>
-    </w:p>
-    <w:p>
       <w:r>
-        <w:rPr>
-          <w:i w:val="0"/>
-          <w:sz w:val="22"/>
-        </w:rPr>
-        <w:t>Statt jeden Spieler einzeln auszustatten, erhält der Verein einen geteilten Gerätepool samt Ersatzbändern. Eine Vereinslizenz deckt alle Mannschaften ab – Herren, Frauen und Jugend. Der Hardware-Umfang skaliert mit dem gewählten Paket:</w:t>
-      </w:r>
-    </w:p>
-    <w:tbl>
-      <w:tblPr>
-        <w:tblStyle w:val="LightGrid-Accent1"/>
-        <w:tblW w:type="auto" w:w="0"/>
-        <w:jc w:val="center"/>
-        <w:tblLook w:firstColumn="1" w:firstRow="1" w:lastColumn="0" w:lastRow="0" w:noHBand="0" w:noVBand="1" w:val="04A0"/>
-      </w:tblPr>
-      <w:tblGrid>
-        <w:gridCol w:w="2351"/>
-        <w:gridCol w:w="2351"/>
-        <w:gridCol w:w="2351"/>
-        <w:gridCol w:w="2351"/>
-      </w:tblGrid>
-      <w:tr>
-        <w:tc>
-          <w:tcPr>
-            <w:tcW w:type="dxa" w:w="2351"/>
-            <w:shd w:val="clear" w:color="auto" w:fill="0E965A"/>
-          </w:tcPr>
-          <w:p>
-            <w:r/>
-            <w:r>
-              <w:rPr>
-                <w:b/>
-                <w:color w:val="FFFFFF"/>
-              </w:rPr>
-              <w:t>Paket</w:t>
-            </w:r>
-          </w:p>
-        </w:tc>
-        <w:tc>
-          <w:tcPr>
-            <w:tcW w:type="dxa" w:w="2351"/>
-            <w:shd w:val="clear" w:color="auto" w:fill="0E965A"/>
-          </w:tcPr>
-          <w:p>
-            <w:r/>
-            <w:r>
-              <w:rPr>
-                <w:b/>
-                <w:color w:val="FFFFFF"/>
-              </w:rPr>
-              <w:t>GPS-Tracker</w:t>
-            </w:r>
-          </w:p>
-        </w:tc>
-        <w:tc>
-          <w:tcPr>
-            <w:tcW w:type="dxa" w:w="2351"/>
-            <w:shd w:val="clear" w:color="auto" w:fill="0E965A"/>
-          </w:tcPr>
-          <w:p>
-            <w:r/>
-            <w:r>
-              <w:rPr>
-                <w:b/>
-                <w:color w:val="FFFFFF"/>
-              </w:rPr>
-              <w:t>Polar H10</w:t>
-            </w:r>
-          </w:p>
-        </w:tc>
-        <w:tc>
-          <w:tcPr>
-            <w:tcW w:type="dxa" w:w="2351"/>
-            <w:shd w:val="clear" w:color="auto" w:fill="0E965A"/>
-          </w:tcPr>
-          <w:p>
-            <w:r/>
-            <w:r>
-              <w:rPr>
-                <w:b/>
-                <w:color w:val="FFFFFF"/>
-              </w:rPr>
-              <w:t>Mannschaften</w:t>
-            </w:r>
-          </w:p>
-        </w:tc>
-      </w:tr>
-      <w:tr>
-        <w:tc>
-          <w:tcPr>
-            <w:tcW w:type="dxa" w:w="2351"/>
-          </w:tcPr>
-          <w:p>
-            <w:r/>
-            <w:r>
-              <w:rPr>
-                <w:b/>
-              </w:rPr>
-              <w:t>Starter</w:t>
-            </w:r>
-          </w:p>
-        </w:tc>
-        <w:tc>
-          <w:tcPr>
-            <w:tcW w:type="dxa" w:w="2351"/>
-          </w:tcPr>
-          <w:p>
-            <w:r/>
-            <w:r>
-              <w:t>15</w:t>
-            </w:r>
-          </w:p>
-        </w:tc>
-        <w:tc>
-          <w:tcPr>
-            <w:tcW w:type="dxa" w:w="2351"/>
-          </w:tcPr>
-          <w:p>
-            <w:r/>
-            <w:r>
-              <w:t>15</w:t>
-            </w:r>
-          </w:p>
-        </w:tc>
-        <w:tc>
-          <w:tcPr>
-            <w:tcW w:type="dxa" w:w="2351"/>
-          </w:tcPr>
-          <w:p>
-            <w:r/>
-            <w:r>
-              <w:t>bis zu 2</w:t>
-            </w:r>
-          </w:p>
-        </w:tc>
-      </w:tr>
-      <w:tr>
-        <w:tc>
-          <w:tcPr>
-            <w:tcW w:type="dxa" w:w="2351"/>
-          </w:tcPr>
-          <w:p>
-            <w:r/>
-            <w:r>
-              <w:rPr>
-                <w:b/>
-              </w:rPr>
-              <w:t>Pro</w:t>
-            </w:r>
-          </w:p>
-        </w:tc>
-        <w:tc>
-          <w:tcPr>
-            <w:tcW w:type="dxa" w:w="2351"/>
-          </w:tcPr>
-          <w:p>
-            <w:r/>
-            <w:r>
-              <w:t>25</w:t>
-            </w:r>
-          </w:p>
-        </w:tc>
-        <w:tc>
-          <w:tcPr>
-            <w:tcW w:type="dxa" w:w="2351"/>
-          </w:tcPr>
-          <w:p>
-            <w:r/>
-            <w:r>
-              <w:t>25</w:t>
-            </w:r>
-          </w:p>
-        </w:tc>
-        <w:tc>
-          <w:tcPr>
-            <w:tcW w:type="dxa" w:w="2351"/>
-          </w:tcPr>
-          <w:p>
-            <w:r/>
-            <w:r>
-              <w:t>bis zu 4</w:t>
-            </w:r>
-          </w:p>
-        </w:tc>
-      </w:tr>
-      <w:tr>
-        <w:tc>
-          <w:tcPr>
-            <w:tcW w:type="dxa" w:w="2351"/>
-          </w:tcPr>
-          <w:p>
-            <w:r/>
-            <w:r>
-              <w:rPr>
-                <w:b/>
-              </w:rPr>
-              <w:t>Elite</w:t>
-            </w:r>
-          </w:p>
-        </w:tc>
-        <w:tc>
-          <w:tcPr>
-            <w:tcW w:type="dxa" w:w="2351"/>
-          </w:tcPr>
-          <w:p>
-            <w:r/>
-            <w:r>
-              <w:t>35</w:t>
-            </w:r>
-          </w:p>
-        </w:tc>
-        <w:tc>
-          <w:tcPr>
-            <w:tcW w:type="dxa" w:w="2351"/>
-          </w:tcPr>
-          <w:p>
-            <w:r/>
-            <w:r>
-              <w:t>35</w:t>
-            </w:r>
-          </w:p>
-        </w:tc>
-        <w:tc>
-          <w:tcPr>
-            <w:tcW w:type="dxa" w:w="2351"/>
-          </w:tcPr>
-          <w:p>
-            <w:r/>
-            <w:r>
-              <w:t>unbegrenzt</w:t>
-            </w:r>
-          </w:p>
-        </w:tc>
-      </w:tr>
-    </w:tbl>
-    <w:p>
-      <w:r>
-        <w:rPr>
-          <w:i w:val="0"/>
-          <w:color w:val="555F6E"/>
-          <w:sz w:val="20"/>
-        </w:rPr>
-        <w:t>Zusätzlich sind im Lieferumfang Trageschutzwesten, Ersatzbänder (z. B. 48 Stück) sowie das Lade- und Checkout-Dock enthalten. Die Hardware wird über eine einmalige Anzahlung (2.200–4.200 €) und die laufende Lizenz finanziert.</w:t>
+        <w:t>Individuelle, auf weibliche Physiologie kalibrierte Baselines statt aus Männermessungen abgeleiteter Referenzwerte – mit Zyklusangabe als kontextualisierendem Score-Faktor.</w:t>
       </w:r>
     </w:p>
     <w:p>
       <w:pPr>
-        <w:pStyle w:val="Heading2"/>
-        <w:spacing w:before="240" w:after="80"/>
+        <w:pStyle w:val="ListParagraph"/>
+        <w:jc w:val="both"/>
       </w:pPr>
       <w:r>
         <w:rPr>
           <w:b/>
-          <w:color w:val="0A0F1A"/>
-          <w:sz w:val="28"/>
         </w:rPr>
-        <w:t>3.3  Software</w:t>
+        <w:t>Entscheidungsunterstützung statt Rohdaten</w:t>
+        <w:br/>
       </w:r>
-    </w:p>
-    <w:p>
       <w:r>
-        <w:rPr>
-          <w:i w:val="0"/>
-          <w:sz w:val="22"/>
-        </w:rPr>
-        <w:t>Die Software ist das eigentliche Wertschöpfungszentrum und der zentrale Differenzierungsfaktor von BetterSquad. Sie verwandelt rohe Sensordaten in handlungsleitende Empfehlungen. Die Plattform besteht aus einem Trainer-Dashboard (Web), einer Spieler-App (Mobile) und einer dahinterliegenden Analyse- und KI-Engine. Als Software-as-a-Service ist sie wartungsfrei für den Verein und wird kontinuierlich weiterentwickelt.</w:t>
+        <w:t>Ampel-Logik und Klartext-Empfehlungen machen das System ohne Sportwissenschaftler:in vor Ort bedienbar.</w:t>
       </w:r>
     </w:p>
     <w:p>
       <w:pPr>
-        <w:pStyle w:val="Heading3"/>
-        <w:spacing w:before="160" w:after="40"/>
+        <w:pStyle w:val="ListParagraph"/>
+        <w:jc w:val="both"/>
       </w:pPr>
       <w:r>
         <w:rPr>
           <w:b/>
-          <w:color w:val="0E965A"/>
-          <w:sz w:val="24"/>
         </w:rPr>
-        <w:t>3.3.1  Trainer-Dashboard (Web)</w:t>
+        <w:t>Datenschutz als Vertrauensvorteil</w:t>
+        <w:br/>
       </w:r>
-    </w:p>
-    <w:p>
       <w:r>
-        <w:rPr>
-          <w:i w:val="0"/>
-          <w:sz w:val="22"/>
-        </w:rPr>
-        <w:t>Das Web-Dashboard ist die Kommandozentrale für Trainer- und Funktionsteam:</w:t>
+        <w:t>DSGVO-konform, Serverstandort Deutschland und eine Architektur, die Zyklusdaten konsequent vor dem Trainerstab verbirgt.</w:t>
       </w:r>
     </w:p>
     <w:p>
       <w:pPr>
-        <w:pStyle w:val="ListBullet"/>
+        <w:keepNext/>
+        <w:spacing w:before="280" w:after="80"/>
+        <w:jc w:val="both"/>
       </w:pPr>
       <w:r>
         <w:rPr>
           <w:b/>
-          <w:color w:val="0E965A"/>
         </w:rPr>
-        <w:t xml:space="preserve">Squad-Ampel: </w:t>
-      </w:r>
-      <w:r>
-        <w:t>Squad-Ampel mit Grün/Gelb/Rot-Status je Spieler auf einen Blick</w:t>
+        <w:t>Entwicklungsstand und Roadmap</w:t>
       </w:r>
     </w:p>
     <w:p>
       <w:pPr>
-        <w:pStyle w:val="ListBullet"/>
+        <w:jc w:val="both"/>
+      </w:pPr>
+      <w:r>
+        <w:t>Der funktionsfähige Frontend-Prototyp aus Trainer:innen-Dashboard und Spieler:innen-App bildet den vollständigen Nutzungsablauf bereits ab und dient als Grundlage für Pilotvereine und Pitch. In Phase 1 folgen die Hardware-Anbindung (Live-Datenstrom aus GPS und Polar H10), das Cloud-Backend sowie ein Pilotbetrieb in einer bis zwei Frauenabteilungen. Phase 2 schärft den Decision Layer auf realen Saisondaten, ergänzt Reporting-Export und Verbandsschnittstellen. Phase 3 skaliert über die DACH-Landesverbände auf rund 85 Vereine bis Jahr 3.</w:t>
+      </w:r>
+    </w:p>
+    <w:p>
+      <w:pPr>
+        <w:keepNext/>
+        <w:spacing w:before="280" w:after="80"/>
+        <w:jc w:val="both"/>
       </w:pPr>
       <w:r>
         <w:rPr>
           <w:b/>
-          <w:color w:val="0E965A"/>
         </w:rPr>
-        <w:t xml:space="preserve">ACWR-Chart: </w:t>
-      </w:r>
-      <w:r>
-        <w:t>Verlauf der durchschnittlichen und maximalen Team-ACWR über 21 Tage</w:t>
+        <w:t>Literaturverzeichnis</w:t>
       </w:r>
     </w:p>
     <w:p>
       <w:pPr>
-        <w:pStyle w:val="ListBullet"/>
+        <w:pStyle w:val="ListParagraph"/>
+        <w:spacing w:after="160"/>
       </w:pPr>
       <w:r>
-        <w:rPr>
-          <w:b/>
-          <w:color w:val="0E965A"/>
-        </w:rPr>
-        <w:t xml:space="preserve">KPI-Board: </w:t>
-      </w:r>
-      <w:r>
-        <w:t>Live-KPIs: Ø Squad-ACWR sowie Anzahl fitter, gefährdeter und Risiko-Spieler</w:t>
+        <w:t>Gabbett, T. J. (2016). The training—injury prevention paradox: Should athletes be training smarter and harder? British Journal of Sports Medicine, 50(5), 273–280. https://doi.org/10.1136/bjsports-2015-095788</w:t>
       </w:r>
     </w:p>
     <w:p>
       <w:pPr>
-        <w:pStyle w:val="ListBullet"/>
+        <w:pStyle w:val="ListParagraph"/>
+        <w:spacing w:after="160"/>
       </w:pPr>
       <w:r>
-        <w:rPr>
-          <w:b/>
-          <w:color w:val="0E965A"/>
-        </w:rPr>
-        <w:t xml:space="preserve">Spieler-Detail: </w:t>
-      </w:r>
-      <w:r>
-        <w:t>Detailansicht pro Spieler mit Last-, HRV- und Hooper-Historie</w:t>
+        <w:t>McNulty, K. L., Elliott-Sale, K. J., Dolan, E., Swinton, P. A., Ansdell, P., Goodall, S., Thomas, K., &amp; Hicks, K. M. (2020). The effects of menstrual cycle phase on exercise performance in eumenorrheic women: A systematic review and meta-analysis. Sports Medicine, 50(10), 1813–1827. https://doi.org/10.1007/s40279-020-01319-3</w:t>
       </w:r>
     </w:p>
     <w:p>
       <w:pPr>
-        <w:pStyle w:val="ListBullet"/>
+        <w:pStyle w:val="ListParagraph"/>
+        <w:spacing w:after="160"/>
       </w:pPr>
       <w:r>
-        <w:rPr>
-          <w:b/>
-          <w:color w:val="0E965A"/>
-        </w:rPr>
-        <w:t xml:space="preserve">Equipment-Monitoring: </w:t>
-      </w:r>
-      <w:r>
-        <w:t>Live-Status des Gerätepools (verfügbar / in Wartung)</w:t>
+        <w:t>Plews, D. J., Laursen, P. B., Stanley, J., Kilding, A. E., &amp; Buchheit, M. (2013). Training adaptation and heart rate variability in elite endurance athletes: Opening the door to effective monitoring. Sports Medicine, 43(9), 773–781. https://doi.org/10.1007/s40279-013-0071-8</w:t>
       </w:r>
     </w:p>
     <w:p>
       <w:pPr>
-        <w:pStyle w:val="Heading3"/>
-        <w:spacing w:before="160" w:after="40"/>
+        <w:pStyle w:val="ListParagraph"/>
+        <w:spacing w:after="160"/>
       </w:pPr>
       <w:r>
-        <w:rPr>
-          <w:b/>
-          <w:color w:val="0E965A"/>
-          <w:sz w:val="24"/>
-        </w:rPr>
-        <w:t>3.3.2  Session Planner</w:t>
-      </w:r>
-    </w:p>
-    <w:p>
-      <w:r>
-        <w:rPr>
-          <w:i w:val="0"/>
-          <w:sz w:val="22"/>
-        </w:rPr>
-        <w:t>Der Session Planner überführt die Analyse direkt in die Trainingsplanung. Er zeigt eine Kaderverfügbarkeits-Matrix mit ACWR, Hooper-Score, Status und empfohlener individueller Trainingsintensität (z. B. „Pause“, „Leicht −20 %“, „Voll“) für die nächste Einheit. Die Empfehlung lässt sich als Sessionplan exportieren und in den Trainingsalltag übernehmen.</w:t>
+        <w:t>Polar Electro. (n.d.). Polar H10 heart rate sensor [Product page]. Polar Electro. https://www.polar.com/de/sensoren/h10-herzfrequenz-sensor</w:t>
       </w:r>
     </w:p>
     <w:p>
       <w:pPr>
-        <w:pStyle w:val="Heading3"/>
-        <w:spacing w:before="160" w:after="40"/>
+        <w:pStyle w:val="ListParagraph"/>
+        <w:spacing w:after="160"/>
       </w:pPr>
       <w:r>
-        <w:rPr>
-          <w:b/>
-          <w:color w:val="0E965A"/>
-          <w:sz w:val="24"/>
-        </w:rPr>
-        <w:t>3.3.3  Spieler-App (Mobile)</w:t>
-      </w:r>
-    </w:p>
-    <w:p>
-      <w:r>
-        <w:rPr>
-          <w:i w:val="0"/>
-          <w:sz w:val="22"/>
-        </w:rPr>
-        <w:t>Die Spieler-App bindet den Athleten aktiv in den Steuerungskreislauf ein:</w:t>
-      </w:r>
-    </w:p>
-    <w:p>
-      <w:pPr>
-        <w:pStyle w:val="ListBullet"/>
-      </w:pPr>
-      <w:r>
-        <w:rPr>
-          <w:b/>
-          <w:color w:val="0E965A"/>
-        </w:rPr>
-        <w:t xml:space="preserve">Readiness: </w:t>
-      </w:r>
-      <w:r>
-        <w:t>Tägliche Readiness-Karte mit persönlicher ACWR und Hooper-Score</w:t>
-      </w:r>
-    </w:p>
-    <w:p>
-      <w:pPr>
-        <w:pStyle w:val="ListBullet"/>
-      </w:pPr>
-      <w:r>
-        <w:rPr>
-          <w:b/>
-          <w:color w:val="0E965A"/>
-        </w:rPr>
-        <w:t xml:space="preserve">Check-in: </w:t>
-      </w:r>
-      <w:r>
-        <w:t>Wellness-Check-in über die vier Dimensionen Schlaf, Muskelkater, Energie, Stimmung</w:t>
-      </w:r>
-    </w:p>
-    <w:p>
-      <w:pPr>
-        <w:pStyle w:val="ListBullet"/>
-      </w:pPr>
-      <w:r>
-        <w:rPr>
-          <w:b/>
-          <w:color w:val="0E965A"/>
-        </w:rPr>
-        <w:t xml:space="preserve">Scan: </w:t>
-      </w:r>
-      <w:r>
-        <w:t>QR-Equipment-Checkout mit geführter Geräteanlage</w:t>
-      </w:r>
-    </w:p>
-    <w:p>
-      <w:pPr>
-        <w:pStyle w:val="ListBullet"/>
-      </w:pPr>
-      <w:r>
-        <w:rPr>
-          <w:b/>
-          <w:color w:val="0E965A"/>
-        </w:rPr>
-        <w:t xml:space="preserve">Stats: </w:t>
-      </w:r>
-      <w:r>
-        <w:t>Persönliche Statistiken: Distanz, Sprints, Höchstgeschwindigkeit, HRV-Trend</w:t>
-      </w:r>
-    </w:p>
-    <w:p>
-      <w:pPr>
-        <w:pStyle w:val="Heading3"/>
-        <w:spacing w:before="160" w:after="40"/>
-      </w:pPr>
-      <w:r>
-        <w:rPr>
-          <w:b/>
-          <w:color w:val="0E965A"/>
-          <w:sz w:val="24"/>
-        </w:rPr>
-        <w:t>3.3.4  Analyse- &amp; KI-Engine</w:t>
-      </w:r>
-    </w:p>
-    <w:p>
-      <w:r>
-        <w:rPr>
-          <w:i w:val="0"/>
-          <w:sz w:val="22"/>
-        </w:rPr>
-        <w:t>Im Kern der Plattform verarbeitet die Analyse-Engine externe Last, interne Last und subjektives Befinden zu konkreten, priorisierten Handlungsempfehlungen:</w:t>
-      </w:r>
-    </w:p>
-    <w:p>
-      <w:pPr>
-        <w:pStyle w:val="ListBullet"/>
-      </w:pPr>
-      <w:r>
-        <w:rPr>
-          <w:b/>
-          <w:color w:val="0E965A"/>
-        </w:rPr>
-        <w:t xml:space="preserve">ACWR-Berechnung: </w:t>
-      </w:r>
-      <w:r>
-        <w:t>Acute:Chronic Workload Ratio aus 7-Tage-Akut- und 28-Tage-Chronik-Last; Schwellen: &gt; 1,3 = erhöht (Gelb), &gt; 1,49 = kritisch (Rot).</w:t>
-      </w:r>
-    </w:p>
-    <w:p>
-      <w:pPr>
-        <w:pStyle w:val="ListBullet"/>
-      </w:pPr>
-      <w:r>
-        <w:rPr>
-          <w:b/>
-          <w:color w:val="0E965A"/>
-        </w:rPr>
-        <w:t xml:space="preserve">Recovery-Monitoring: </w:t>
-      </w:r>
-      <w:r>
-        <w:t>HRV-Trendanalyse und Asymmetrie-Erkennung als Frühwarnsystem für Übertraining und Verletzungsrisiko (5–10 Tage Vorlauf).</w:t>
-      </w:r>
-    </w:p>
-    <w:p>
-      <w:pPr>
-        <w:pStyle w:val="ListBullet"/>
-      </w:pPr>
-      <w:r>
-        <w:rPr>
-          <w:b/>
-          <w:color w:val="0E965A"/>
-        </w:rPr>
-        <w:t xml:space="preserve">KI-Empfehlungen: </w:t>
-      </w:r>
-      <w:r>
-        <w:t>Verständliche Klartext-Empfehlungen je Spieler und für das Gesamtteam – ohne dass ein Sportwissenschaftler die Rohdaten interpretieren muss.</w:t>
-      </w:r>
-    </w:p>
-    <w:tbl>
-      <w:tblPr>
-        <w:tblW w:type="auto" w:w="0"/>
-        <w:jc w:val="center"/>
-        <w:tblLook w:firstColumn="1" w:firstRow="1" w:lastColumn="0" w:lastRow="0" w:noHBand="0" w:noVBand="1" w:val="04A0"/>
-      </w:tblPr>
-      <w:tblGrid>
-        <w:gridCol w:w="9406"/>
-      </w:tblGrid>
-      <w:tr>
-        <w:tc>
-          <w:tcPr>
-            <w:tcW w:type="dxa" w:w="9406"/>
-            <w:shd w:val="clear" w:color="auto" w:fill="ECFDF5"/>
-          </w:tcPr>
-          <w:p>
-            <w:r/>
-            <w:r>
-              <w:rPr>
-                <w:b/>
-                <w:color w:val="0E965A"/>
-                <w:sz w:val="22"/>
-              </w:rPr>
-              <w:t>Kundennutzen der Software</w:t>
-            </w:r>
-          </w:p>
-          <w:p>
-            <w:r>
-              <w:rPr>
-                <w:sz w:val="21"/>
-              </w:rPr>
-              <w:t>Aus Zahlen werden Entscheidungen: Die Plattform sagt nicht nur, dass ein Spieler gefährdet ist, sondern auch, was zu tun ist – z. B. „Intensität um 20 % reduzieren, Fokus Taktik + Regeneration“. Das ersetzt teures Fachpersonal vor Ort.</w:t>
-            </w:r>
-          </w:p>
-        </w:tc>
-      </w:tr>
-    </w:tbl>
-    <w:p>
-      <w:pPr>
-        <w:pStyle w:val="Heading2"/>
-        <w:spacing w:before="240" w:after="80"/>
-      </w:pPr>
-      <w:r>
-        <w:rPr>
-          <w:b/>
-          <w:color w:val="0A0F1A"/>
-          <w:sz w:val="28"/>
-        </w:rPr>
-        <w:t>3.4  Kundennutzen &amp; Alleinstellungsmerkmale</w:t>
-      </w:r>
-    </w:p>
-    <w:p>
-      <w:r>
-        <w:rPr>
-          <w:i w:val="0"/>
-          <w:sz w:val="22"/>
-        </w:rPr>
-        <w:t>BetterSquad ist die erste Lösung, die GPS-Tracking und Recovery-Monitoring in einem einzigen, für den Amateurbereich bezahlbaren System verbindet. Die wesentlichen Alleinstellungsmerkmale sind:</w:t>
-      </w:r>
-    </w:p>
-    <w:p>
-      <w:pPr>
-        <w:pStyle w:val="ListBullet"/>
-      </w:pPr>
-      <w:r>
-        <w:rPr>
-          <w:b/>
-          <w:color w:val="0E965A"/>
-        </w:rPr>
-        <w:t xml:space="preserve">Integration: </w:t>
-      </w:r>
-      <w:r>
-        <w:t>Externe und interne Last plus subjektives Befinden in einer Plattform statt drei getrennter Insellösungen.</w:t>
-      </w:r>
-    </w:p>
-    <w:p>
-      <w:pPr>
-        <w:pStyle w:val="ListBullet"/>
-      </w:pPr>
-      <w:r>
-        <w:rPr>
-          <w:b/>
-          <w:color w:val="0E965A"/>
-        </w:rPr>
-        <w:t xml:space="preserve">Preis: </w:t>
-      </w:r>
-      <w:r>
-        <w:t>219 €/Monat statt ~15.000 $/Jahr – Profi-Methodik wird erstmals für Amateur- und Nachwuchsvereine erschwinglich.</w:t>
-      </w:r>
-    </w:p>
-    <w:p>
-      <w:pPr>
-        <w:pStyle w:val="ListBullet"/>
-      </w:pPr>
-      <w:r>
-        <w:rPr>
-          <w:b/>
-          <w:color w:val="0E965A"/>
-        </w:rPr>
-        <w:t xml:space="preserve">Pool-Modell: </w:t>
-      </w:r>
-      <w:r>
-        <w:t>Eine Vereinslizenz und ein Gerätepool für alle Teams (Herren, Frauen, Jugend) statt Einzelausstattung.</w:t>
-      </w:r>
-    </w:p>
-    <w:p>
-      <w:pPr>
-        <w:pStyle w:val="ListBullet"/>
-      </w:pPr>
-      <w:r>
-        <w:rPr>
-          <w:b/>
-          <w:color w:val="0E965A"/>
-        </w:rPr>
-        <w:t xml:space="preserve">Einfachheit: </w:t>
-      </w:r>
-      <w:r>
-        <w:t>Bedienbar ohne Sportwissenschaftler – Ampel-Logik und Klartext-Empfehlungen statt Rohdaten-Tabellen.</w:t>
-      </w:r>
-    </w:p>
-    <w:p>
-      <w:pPr>
-        <w:pStyle w:val="ListBullet"/>
-      </w:pPr>
-      <w:r>
-        <w:rPr>
-          <w:b/>
-          <w:color w:val="0E965A"/>
-        </w:rPr>
-        <w:t xml:space="preserve">Datenschutz: </w:t>
-      </w:r>
-      <w:r>
-        <w:t>DSGVO-konform, Serverstandort Deutschland, „Made in Germany“ – ein echter Vertrauensvorteil bei sensiblen Gesundheitsdaten.</w:t>
-      </w:r>
-    </w:p>
-    <w:p>
-      <w:pPr>
-        <w:pStyle w:val="Heading2"/>
-        <w:spacing w:before="240" w:after="80"/>
-      </w:pPr>
-      <w:r>
-        <w:rPr>
-          <w:b/>
-          <w:color w:val="0A0F1A"/>
-          <w:sz w:val="28"/>
-        </w:rPr>
-        <w:t>3.5  Wissenschaftliche Fundierung</w:t>
-      </w:r>
-    </w:p>
-    <w:p>
-      <w:r>
-        <w:rPr>
-          <w:i w:val="0"/>
-          <w:sz w:val="22"/>
-        </w:rPr>
-        <w:t>Alle Kennzahlen des Systems beruhen auf etablierten sportwissenschaftlichen Methoden. Das schafft Glaubwürdigkeit gegenüber Vereinen und Verbänden und grenzt BetterSquad von rein technikgetriebenen Tracking-Gadgets ab:</w:t>
-      </w:r>
-    </w:p>
-    <w:p>
-      <w:pPr>
-        <w:pStyle w:val="ListBullet"/>
-      </w:pPr>
-      <w:r>
-        <w:rPr>
-          <w:b/>
-          <w:color w:val="0E965A"/>
-        </w:rPr>
-        <w:t xml:space="preserve">Gabbett et al.: </w:t>
-      </w:r>
-      <w:r>
-        <w:t>ACWR-Belastungssteuerung nach Gabbett et al. als validiertes Modell zur Verletzungsprävention.</w:t>
-      </w:r>
-    </w:p>
-    <w:p>
-      <w:pPr>
-        <w:pStyle w:val="ListBullet"/>
-      </w:pPr>
-      <w:r>
-        <w:rPr>
-          <w:b/>
-          <w:color w:val="0E965A"/>
-        </w:rPr>
-        <w:t xml:space="preserve">Saw et al. (2016): </w:t>
-      </w:r>
-      <w:r>
-        <w:t>Der Wellness-Check-in folgt der nach Saw et al. (2016) validierten Hooper-Skala zur Erfassung der subjektiven Befindlichkeit.</w:t>
-      </w:r>
-    </w:p>
-    <w:p>
-      <w:pPr>
-        <w:pStyle w:val="ListBullet"/>
-      </w:pPr>
-      <w:r>
-        <w:rPr>
-          <w:b/>
-          <w:color w:val="0E965A"/>
-        </w:rPr>
-        <w:t xml:space="preserve">HRV-Forschung: </w:t>
-      </w:r>
-      <w:r>
-        <w:t>HRV als anerkannter physiologischer Marker für Regeneration und autonome Erholungsfähigkeit.</w:t>
-      </w:r>
-    </w:p>
-    <w:p>
-      <w:pPr>
-        <w:pStyle w:val="Heading2"/>
-        <w:spacing w:before="240" w:after="80"/>
-      </w:pPr>
-      <w:r>
-        <w:rPr>
-          <w:b/>
-          <w:color w:val="0A0F1A"/>
-          <w:sz w:val="28"/>
-        </w:rPr>
-        <w:t>3.6  Entwicklungsstand &amp; Roadmap</w:t>
-      </w:r>
-    </w:p>
-    <w:p>
-      <w:r>
-        <w:rPr>
-          <w:i w:val="0"/>
-          <w:sz w:val="22"/>
-        </w:rPr>
-        <w:t>Der funktionsfähige Frontend-Prototyp aus Trainer-Dashboard und Spieler-App bildet den vollständigen Nutzungsablauf bereits ab und dient als Grundlage für Pilotvereine und Pitch. Die weitere Entwicklung gliedert sich in nachvollziehbare Schritte:</w:t>
-      </w:r>
-    </w:p>
-    <w:p>
-      <w:pPr>
-        <w:pStyle w:val="ListBullet"/>
-      </w:pPr>
-      <w:r>
-        <w:rPr>
-          <w:b/>
-          <w:color w:val="0E965A"/>
-        </w:rPr>
-        <w:t xml:space="preserve">Status quo: </w:t>
-      </w:r>
-      <w:r>
-        <w:t>Validierter, klickbarer Prototyp des End-to-End-Nutzerflusses.</w:t>
-      </w:r>
-    </w:p>
-    <w:p>
-      <w:pPr>
-        <w:pStyle w:val="ListBullet"/>
-      </w:pPr>
-      <w:r>
-        <w:rPr>
-          <w:b/>
-          <w:color w:val="0E965A"/>
-        </w:rPr>
-        <w:t xml:space="preserve">Phase 1: </w:t>
-      </w:r>
-      <w:r>
-        <w:t>Hardware-Anbindung (Live-Datenstrom GPS + Polar H10), Cloud-Backend, Pilotbetrieb in 1–2 Vereinen.</w:t>
-      </w:r>
-    </w:p>
-    <w:p>
-      <w:pPr>
-        <w:pStyle w:val="ListBullet"/>
-      </w:pPr>
-      <w:r>
-        <w:rPr>
-          <w:b/>
-          <w:color w:val="0E965A"/>
-        </w:rPr>
-        <w:t xml:space="preserve">Phase 2: </w:t>
-      </w:r>
-      <w:r>
-        <w:t>Schärfung der KI-Empfehlungen auf realen Saisondaten, Reporting-Export, Verbandsschnittstellen.</w:t>
-      </w:r>
-    </w:p>
-    <w:p>
-      <w:pPr>
-        <w:pStyle w:val="ListBullet"/>
-      </w:pPr>
-      <w:r>
-        <w:rPr>
-          <w:b/>
-          <w:color w:val="0E965A"/>
-        </w:rPr>
-        <w:t xml:space="preserve">Phase 3: </w:t>
-      </w:r>
-      <w:r>
-        <w:t>Skalierung auf 85 Vereine bis Jahr 3, weitere Sportarten, Liga-Benchmarks.</w:t>
-      </w:r>
-    </w:p>
-    <w:p>
-      <w:pPr>
-        <w:pStyle w:val="Heading2"/>
-        <w:spacing w:before="240" w:after="80"/>
-      </w:pPr>
-      <w:r>
-        <w:rPr>
-          <w:b/>
-          <w:color w:val="0A0F1A"/>
-          <w:sz w:val="28"/>
-        </w:rPr>
-        <w:t>3.7  Datenschutz &amp; rechtliche Aspekte</w:t>
-      </w:r>
-    </w:p>
-    <w:p>
-      <w:r>
-        <w:rPr>
-          <w:i w:val="0"/>
-          <w:sz w:val="22"/>
-        </w:rPr>
-        <w:t>Da BetterSquad sensible Gesundheits- und Leistungsdaten verarbeitet, ist Datenschutz ein integraler Produktbestandteil und kein nachgelagertes Thema. Die gesamte Datenverarbeitung erfolgt DSGVO-konform mit Serverstandort in Deutschland. Daten werden verschlüsselt übertragen, Zugriffe sind rollenbasiert (Trainer / Spieler) getrennt. Dieser klare Datenschutzfokus ist zugleich ein vertrieblicher Wettbewerbsvorteil gegenüber internationalen Anbietern.</w:t>
-      </w:r>
-    </w:p>
-    <w:p/>
-    <w:p>
-      <w:r>
-        <w:rPr>
-          <w:i/>
-          <w:color w:val="555F6E"/>
-          <w:sz w:val="18"/>
-        </w:rPr>
-        <w:t>BetterSquad · Businessplan Teil 3: Produkt / Dienstleistung</w:t>
+        <w:t>Saw, A. E., Main, L. C., &amp; Gastin, P. B. (2016). Monitoring the athlete training response: Subjective self-reported measures trump commonly used objective measures – A systematic review. British Journal of Sports Medicine, 50(5), 281–291. https://doi.org/10.1136/bjsports-2015-094758</w:t>
       </w:r>
     </w:p>
     <w:sectPr>
       <w:pgSz w:w="12240" w:h="15840"/>
-      <w:pgMar w:top="1247" w:right="1417" w:bottom="1247" w:left="1417" w:header="720" w:footer="720" w:gutter="0"/>
+      <w:pgMar w:top="1417" w:right="1417" w:bottom="1417" w:left="1417" w:header="720" w:footer="720" w:gutter="0"/>
       <w:cols w:space="720"/>
       <w:docGrid w:linePitch="360"/>
     </w:sectPr>
@@ -1681,7 +888,7 @@
     <w:qFormat/>
     <w:rsid w:val="00FC693F"/>
     <w:pPr>
-      <w:spacing w:after="120" w:line="300" w:lineRule="auto"/>
+      <w:spacing w:after="160" w:line="259" w:lineRule="auto"/>
     </w:pPr>
     <w:rPr>
       <w:rFonts w:ascii="Calibri" w:hAnsi="Calibri"/>

</xml_diff>

<commit_message>
Produkt-Kapitel: aktualisierter Inhalt im urspruenglichen Branding-Format
</commit_message>
<xml_diff>
--- a/BetterSquad_Businessplan_3_Produkt.docx
+++ b/BetterSquad_Businessplan_3_Produkt.docx
@@ -3,47 +3,102 @@
 <w:document xmlns:wpc="http://schemas.microsoft.com/office/word/2010/wordprocessingCanvas" xmlns:mo="http://schemas.microsoft.com/office/mac/office/2008/main" xmlns:mc="http://schemas.openxmlformats.org/markup-compatibility/2006" xmlns:mv="urn:schemas-microsoft-com:mac:vml" xmlns:o="urn:schemas-microsoft-com:office:office" xmlns:r="http://schemas.openxmlformats.org/officeDocument/2006/relationships" xmlns:m="http://schemas.openxmlformats.org/officeDocument/2006/math" xmlns:v="urn:schemas-microsoft-com:vml" xmlns:wp14="http://schemas.microsoft.com/office/word/2010/wordprocessingDrawing" xmlns:wp="http://schemas.openxmlformats.org/drawingml/2006/wordprocessingDrawing" xmlns:w10="urn:schemas-microsoft-com:office:word" xmlns:w="http://schemas.openxmlformats.org/wordprocessingml/2006/main" xmlns:w14="http://schemas.microsoft.com/office/word/2010/wordml" xmlns:wpg="http://schemas.microsoft.com/office/word/2010/wordprocessingGroup" xmlns:wpi="http://schemas.microsoft.com/office/word/2010/wordprocessingInk" xmlns:wne="http://schemas.microsoft.com/office/word/2006/wordml" xmlns:wps="http://schemas.microsoft.com/office/word/2010/wordprocessingShape" mc:Ignorable="w14 wp14">
   <w:body>
     <w:p>
+      <w:pPr>
+        <w:jc w:val="left"/>
+      </w:pPr>
       <w:r>
         <w:rPr>
           <w:b/>
-          <w:sz w:val="30"/>
+          <w:color w:val="0E965A"/>
+          <w:sz w:val="56"/>
         </w:rPr>
-        <w:t>Produkt / Dienstleistung</w:t>
+        <w:t>BetterSquad</w:t>
+      </w:r>
+      <w:r>
+        <w:rPr>
+          <w:color w:val="555F6E"/>
+          <w:sz w:val="32"/>
+        </w:rPr>
+        <w:t xml:space="preserve">  |  Businessplan</w:t>
+      </w:r>
+    </w:p>
+    <w:p>
+      <w:r>
+        <w:rPr>
+          <w:i/>
+          <w:color w:val="555F6E"/>
+          <w:sz w:val="24"/>
+        </w:rPr>
+        <w:t>Investiere in deinen Kader. Nicht in einzelne Spieler:innen.</w:t>
+      </w:r>
+    </w:p>
+    <w:p>
+      <w:r>
+        <w:rPr>
+          <w:i w:val="0"/>
+          <w:color w:val="555F6E"/>
+          <w:sz w:val="20"/>
+        </w:rPr>
+        <w:t>WiSo Köln · Bachelorseminar · Wintersemester 2024/25</w:t>
+      </w:r>
+    </w:p>
+    <w:p/>
+    <w:p>
+      <w:pPr>
+        <w:pStyle w:val="Heading1"/>
+        <w:spacing w:before="320" w:after="160"/>
+      </w:pPr>
+      <w:r>
+        <w:rPr>
+          <w:b/>
+          <w:color w:val="0E965A"/>
+          <w:sz w:val="40"/>
+        </w:rPr>
+        <w:t>3  Produkt / Dienstleistung</w:t>
+      </w:r>
+    </w:p>
+    <w:p>
+      <w:r>
+        <w:rPr>
+          <w:i w:val="0"/>
+          <w:sz w:val="22"/>
+        </w:rPr>
+        <w:t>Dieses Kapitel beschreibt das Leistungsangebot von BetterSquad entlang der beiden untrennbaren Bausteine Hardware und Software. BetterSquad ist ein integriertes Belastungssteuerungs-System für den Amateur- und Semi-Pro-Frauenfußball im DACH-Raum, das professionelle Methodik der Belastungssteuerung für Frauenabteilungen verfügbar macht – als schlüsselfertiges Komplettsystem aus tragbarer Sensorik und cloudbasierter Analysesoftware.</w:t>
       </w:r>
     </w:p>
     <w:p>
       <w:pPr>
-        <w:keepNext/>
-        <w:spacing w:before="200" w:after="80"/>
-        <w:jc w:val="both"/>
+        <w:pStyle w:val="Heading2"/>
+        <w:spacing w:before="240" w:after="80"/>
       </w:pPr>
       <w:r>
         <w:rPr>
           <w:b/>
+          <w:color w:val="0A0F1A"/>
+          <w:sz w:val="28"/>
         </w:rPr>
-        <w:t>Produktüberblick und Wertversprechen</w:t>
+        <w:t>3.1  Produktüberblick und Wertversprechen</w:t>
       </w:r>
     </w:p>
     <w:p>
-      <w:pPr>
-        <w:jc w:val="both"/>
-      </w:pPr>
       <w:r>
-        <w:t>BetterSquad ist ein integriertes Belastungssteuerungs-System für den Amateur- und Semi-Pro-Frauenfußball im DACH-Raum. Das Produkt verbindet vereinseigene Sensor-Hardware im Pool-Modell mit einer Software-Plattform, die rohe Mess- und Befindlichkeitsdaten nicht als Performance-Dashboard ausgibt, sondern zu einer konkreten, individuell auf die Spielerin kalibrierten Trainingsempfehlung verdichtet. Der inhaltliche Kern ist damit kein Tracking-Gadget, sondern ein female-informed Decision Layer: eine Entscheidungsschicht, die die äußere Belastung (GPS), die innere Belastung (Herzfrequenz und HRV) und das subjektive Befinden (Hooper-Index) auf Basis individueller Baselines jeder Spielerin auswertet.</w:t>
+        <w:rPr>
+          <w:i w:val="0"/>
+          <w:sz w:val="22"/>
+        </w:rPr>
+        <w:t>BetterSquad verbindet vereinseigene Sensor-Hardware im Pool-Modell mit einer Software-Plattform, die rohe Mess- und Befindlichkeitsdaten nicht als Performance-Dashboard ausgibt, sondern zu einer konkreten, individuell auf die Spielerin kalibrierten Trainingsempfehlung verdichtet. Der inhaltliche Kern ist damit kein Tracking-Gadget, sondern ein female-informed Decision Layer: eine Entscheidungsschicht, die die äußere Belastung (GPS), die innere Belastung (Herzfrequenz und HRV) und das subjektive Befinden (Hooper-Index) auf Basis individueller Baselines jeder Spielerin auswertet.</w:t>
       </w:r>
     </w:p>
     <w:p>
-      <w:pPr>
-        <w:jc w:val="both"/>
-      </w:pPr>
       <w:r>
-        <w:t>Das Leistungsangebot adressiert eine strukturelle Lücke: Etablierte Hardware-Anbieter richten sich mit Pro-Spieler:in-Preislogik und überwiegend aus Männermessungen abgeleiteten Referenzwerten an Elite- und Profistrukturen, während female-spezifische Software-Plattformen zwar die Frauenphysiologie adressieren, aber weder Vereins-Hardware noch eine objektive, belastungsbasierte Steuerung bieten. BetterSquad besetzt genau die Schnittstelle beider Welten – zu einem Preis, der für eine Regionalliga- oder Oberliga-Frauenabteilung tragbar ist (ab 219 € pro Monat statt vier- bis fünfstelliger Jahresaufwände bei Pro-Gerät-Modellen).</w:t>
+        <w:rPr>
+          <w:i w:val="0"/>
+          <w:sz w:val="22"/>
+        </w:rPr>
+        <w:t>Das Angebot adressiert eine strukturelle Lücke: Etablierte Hardware-Anbieter richten sich mit Pro-Spieler:in-Preislogik und überwiegend aus Männermessungen abgeleiteten Referenzwerten an Elite- und Profistrukturen, während female-spezifische Software-Plattformen zwar die Frauenphysiologie adressieren, aber weder Vereins-Hardware noch eine objektive, belastungsbasierte Steuerung bieten. BetterSquad besetzt genau die Schnittstelle beider Welten.</w:t>
       </w:r>
     </w:p>
     <w:p>
-      <w:pPr>
-        <w:jc w:val="both"/>
-      </w:pPr>
       <w:r>
         <w:rPr>
           <w:b w:val="0"/>
@@ -84,389 +139,1310 @@
         <w:rPr>
           <w:b w:val="0"/>
         </w:rPr>
-        <w:t>mit datenschutzfreundlicher Architektur. Die folgenden Abschnitte beschreiben Hardware und Software entlang dieser Bausteine.</w:t>
+        <w:t>mit datenschutzfreundlicher Architektur.</w:t>
       </w:r>
     </w:p>
+    <w:tbl>
+      <w:tblPr>
+        <w:tblW w:type="auto" w:w="0"/>
+        <w:jc w:val="center"/>
+        <w:tblLook w:firstColumn="1" w:firstRow="1" w:lastColumn="0" w:lastRow="0" w:noHBand="0" w:noVBand="1" w:val="04A0"/>
+      </w:tblPr>
+      <w:tblGrid>
+        <w:gridCol w:w="9406"/>
+      </w:tblGrid>
+      <w:tr>
+        <w:tc>
+          <w:tcPr>
+            <w:tcW w:type="dxa" w:w="9406"/>
+            <w:shd w:val="clear" w:color="auto" w:fill="ECFDF5"/>
+          </w:tcPr>
+          <w:p>
+            <w:r/>
+            <w:r>
+              <w:rPr>
+                <w:b/>
+                <w:color w:val="0E965A"/>
+                <w:sz w:val="22"/>
+              </w:rPr>
+              <w:t>Kernversprechen</w:t>
+            </w:r>
+          </w:p>
+          <w:p>
+            <w:r>
+              <w:rPr>
+                <w:sz w:val="21"/>
+              </w:rPr>
+              <w:t>Profi-Methodik der Belastungssteuerung zum Amateur-Preis: ab 219 €/Monat statt vier- bis fünfstelliger Jahresaufwände bei Pro-Gerät-Modellen – DSGVO-konform, mit Serverstandort Deutschland und female-informed Decision Layer.</w:t>
+            </w:r>
+          </w:p>
+        </w:tc>
+      </w:tr>
+    </w:tbl>
     <w:p>
       <w:pPr>
-        <w:keepNext/>
-        <w:spacing w:before="280" w:after="80"/>
-        <w:jc w:val="both"/>
+        <w:pStyle w:val="Heading2"/>
+        <w:spacing w:before="240" w:after="80"/>
       </w:pPr>
       <w:r>
         <w:rPr>
           <w:b/>
+          <w:color w:val="0A0F1A"/>
+          <w:sz w:val="28"/>
         </w:rPr>
-        <w:t>Hardware: vereinseigener Sensor-Pool</w:t>
+        <w:t>3.2  Hardware: vereinseigener Sensor-Pool</w:t>
       </w:r>
     </w:p>
     <w:p>
-      <w:pPr>
-        <w:jc w:val="both"/>
-      </w:pPr>
       <w:r>
+        <w:rPr>
+          <w:i w:val="0"/>
+          <w:sz w:val="22"/>
+        </w:rPr>
         <w:t>Die Hardware bildet die objektive Datengrundlage des Systems. Bewusst setzt BetterSquad auf erprobte, kalibrierte Standardkomponenten statt auf teure Eigenentwicklungen. Das senkt Stückkosten und Ausfallrisiko, verkürzt die Time-to-Market und sichert eine validierte Messqualität. Die Geräte werden nicht – wie im Pro-Spieler:in-Modell der etablierten Anbieter – einzeln pro Athletin beschafft, sondern der Frauenabteilung als geteilter Pool zur Verfügung gestellt. Eine typische Abteilung mit drei bis fünf Teams und 60 bis 80 Spielerinnen wird so mit einem überschaubaren Gerätebestand abgedeckt.</w:t>
       </w:r>
     </w:p>
     <w:p>
       <w:pPr>
-        <w:keepNext/>
-        <w:spacing w:before="160" w:after="80"/>
-        <w:jc w:val="both"/>
+        <w:pStyle w:val="Heading3"/>
+        <w:spacing w:before="160" w:after="40"/>
       </w:pPr>
       <w:r>
         <w:rPr>
           <w:b/>
+          <w:color w:val="0E965A"/>
+          <w:sz w:val="24"/>
         </w:rPr>
-        <w:t>GPS-Tracker (äußere Belastung)</w:t>
+        <w:t>3.2.1  GPS-Tracker (äußere Belastung)</w:t>
+      </w:r>
+    </w:p>
+    <w:p>
+      <w:r>
+        <w:rPr>
+          <w:i w:val="0"/>
+          <w:sz w:val="22"/>
+        </w:rPr>
+        <w:t>Der GPS-Tracker wird in einer leichten Trageweste zwischen den Schulterblättern getragen und erfasst die äußere Belastung in Echtzeit:</w:t>
       </w:r>
     </w:p>
     <w:p>
       <w:pPr>
-        <w:jc w:val="both"/>
+        <w:pStyle w:val="ListBullet"/>
       </w:pPr>
       <w:r>
-        <w:t>Der GPS-Tracker wird in einer leichten Trageweste zwischen den Schulterblättern getragen und erfasst die äußere Belastung in Echtzeit: zurückgelegte Distanz und Distanz in Hochintensitäts-Zonen, Anzahl der Sprints, Höchstgeschwindigkeit sowie Beschleunigungs- und Abbrems-Lasten. Aus diesen Rohdaten wird die externe Tageslast (Load) berechnet, die als Grundgröße in das ACWR-Modell einfließt.</w:t>
+        <w:rPr>
+          <w:b/>
+          <w:color w:val="0E965A"/>
+        </w:rPr>
+        <w:t xml:space="preserve">Laufleistung: </w:t>
+      </w:r>
+      <w:r>
+        <w:t>Zurückgelegte Distanz und Distanz in Hochintensitäts-Zonen</w:t>
       </w:r>
     </w:p>
     <w:p>
       <w:pPr>
-        <w:keepNext/>
-        <w:spacing w:before="160" w:after="80"/>
-        <w:jc w:val="both"/>
+        <w:pStyle w:val="ListBullet"/>
       </w:pPr>
       <w:r>
         <w:rPr>
           <w:b/>
+          <w:color w:val="0E965A"/>
         </w:rPr>
-        <w:t>Polar-H10-Pulsgurte (innere Belastung und Recovery)</w:t>
+        <w:t xml:space="preserve">Sprints &amp; Speed: </w:t>
+      </w:r>
+      <w:r>
+        <w:t>Anzahl der Sprints sowie Höchstgeschwindigkeit (km/h)</w:t>
       </w:r>
     </w:p>
     <w:p>
       <w:pPr>
-        <w:jc w:val="both"/>
+        <w:pStyle w:val="ListBullet"/>
       </w:pPr>
       <w:r>
-        <w:t>Der medizinisch validierte Brustgurt Polar H10 misst die innere Belastung und liefert die Datenbasis für das Recovery-Monitoring: die Herzfrequenz in Echtzeit zur Steuerung der Trainingsintensität sowie die Herzfrequenzvariabilität (HRV) als sensiblen Frühindikator der Regeneration. Über eine Trendanalyse lassen sich Überlastungstendenzen mehrere Tage früher erkennen, als sie sich in der reinen Leistung zeigen. Als etablierter Industriestandard mit hoher EKG-Genauigkeit reduziert der Polar H10 zugleich den Beschaffungs- und Wartungsaufwand.</w:t>
+        <w:rPr>
+          <w:b/>
+          <w:color w:val="0E965A"/>
+        </w:rPr>
+        <w:t xml:space="preserve">HI-Runs: </w:t>
+      </w:r>
+      <w:r>
+        <w:t>High-Intensity-Runs als Indikator azyklischer Belastung</w:t>
       </w:r>
     </w:p>
     <w:p>
       <w:pPr>
-        <w:keepNext/>
-        <w:spacing w:before="160" w:after="80"/>
-        <w:jc w:val="both"/>
+        <w:pStyle w:val="ListBullet"/>
       </w:pPr>
       <w:r>
         <w:rPr>
           <w:b/>
+          <w:color w:val="0E965A"/>
         </w:rPr>
-        <w:t>Tracker-Dock und QR-Checkout</w:t>
+        <w:t xml:space="preserve">Acc/Dec: </w:t>
+      </w:r>
+      <w:r>
+        <w:t>Beschleunigungs- und Abbrems-Lasten zur Erkennung von Asymmetrien</w:t>
+      </w:r>
+    </w:p>
+    <w:p>
+      <w:r>
+        <w:rPr>
+          <w:i w:val="0"/>
+          <w:color w:val="555F6E"/>
+          <w:sz w:val="20"/>
+        </w:rPr>
+        <w:t>Aus diesen Rohdaten wird die externe Tageslast (Load) berechnet, die als Grundgröße in das ACWR-Modell einfließt.</w:t>
       </w:r>
     </w:p>
     <w:p>
       <w:pPr>
-        <w:jc w:val="both"/>
+        <w:pStyle w:val="Heading3"/>
+        <w:spacing w:before="160" w:after="40"/>
       </w:pPr>
       <w:r>
-        <w:t>Die Geräte lagern und laden in einem zentralen Tracker-Dock. Vor dem Training scannt jede Spielerin über die App einen QR-Code am Dock und erhält automatisch einen freien Tracker und Pulsgurt zugewiesen. Das löst zwei zentrale Probleme des Amateurbetriebs: Es macht eine feste 1:1-Zuordnung überflüssig (Voraussetzung des Pool-Modells) und stellt die korrekte, verwechslungsfreie Datenzuordnung sicher, ohne dass Personal die Geräte manuell verteilen muss. Eine Live-Übersicht zeigt jederzeit, welche Geräte verfügbar, ausgegeben oder in Wartung sind.</w:t>
+        <w:rPr>
+          <w:b/>
+          <w:color w:val="0E965A"/>
+          <w:sz w:val="24"/>
+        </w:rPr>
+        <w:t>3.2.2  Polar-H10-Pulsgurte (innere Belastung &amp; Recovery)</w:t>
+      </w:r>
+    </w:p>
+    <w:p>
+      <w:r>
+        <w:rPr>
+          <w:i w:val="0"/>
+          <w:sz w:val="22"/>
+        </w:rPr>
+        <w:t>Der medizinisch validierte Brustgurt Polar H10 misst die innere Belastung und liefert die Datenbasis für das Recovery-Monitoring:</w:t>
       </w:r>
     </w:p>
     <w:p>
       <w:pPr>
-        <w:keepNext/>
-        <w:spacing w:before="160" w:after="80"/>
-        <w:jc w:val="both"/>
+        <w:pStyle w:val="ListBullet"/>
       </w:pPr>
       <w:r>
         <w:rPr>
           <w:b/>
+          <w:color w:val="0E965A"/>
         </w:rPr>
-        <w:t>Pool-Modell und Pakete</w:t>
+        <w:t xml:space="preserve">HR: </w:t>
+      </w:r>
+      <w:r>
+        <w:t>Herzfrequenz in Echtzeit zur Steuerung der Trainingsintensität</w:t>
       </w:r>
     </w:p>
     <w:p>
       <w:pPr>
-        <w:jc w:val="both"/>
+        <w:pStyle w:val="ListBullet"/>
       </w:pPr>
       <w:r>
-        <w:t>Eine Vereinslizenz deckt die gesamte Frauenabteilung ab; der Hardware-Umfang skaliert mit dem gewählten Paket. Das Einstiegspaket Starter umfasst 15 GPS-Tracker und 15 Polar-H10-Gurte für bis zu zwei Teams (219 € pro Monat), das Paket Pro 25 Geräte-Sets für bis zu vier Teams (349 € pro Monat) und das Paket Elite 35 Geräte-Sets für eine unbegrenzte Zahl an Teams (459 € pro Monat). Hinzu kommen Trageschutzwesten, Ersatzbänder und das Lade- und Checkout-Dock. Die Hardware wird über eine einmalige Anzahlung (2.200 bis 4.200 €) und die laufende Lizenz finanziert; sie verbleibt im Nutzungsrecht der Abteilung. Diese geteilte Nutzung ist nicht nur ein Preisvorteil, sondern erzeugt zugleich Wechselkosten: Konfiguration und individuelle Baselines der Spielerinnen entstehen über Monate und gingen bei einem Anbieterwechsel verloren.</w:t>
+        <w:rPr>
+          <w:b/>
+          <w:color w:val="0E965A"/>
+        </w:rPr>
+        <w:t xml:space="preserve">HRV: </w:t>
+      </w:r>
+      <w:r>
+        <w:t>Herzfrequenzvariabilität (HRV) als sensibler Frühindikator der Regeneration</w:t>
       </w:r>
     </w:p>
     <w:p>
       <w:pPr>
-        <w:keepNext/>
-        <w:spacing w:before="280" w:after="80"/>
-        <w:jc w:val="both"/>
+        <w:pStyle w:val="ListBullet"/>
       </w:pPr>
       <w:r>
         <w:rPr>
           <w:b/>
+          <w:color w:val="0E965A"/>
         </w:rPr>
-        <w:t>Software: Decision Layer statt Rohdaten-Dashboard</w:t>
+        <w:t xml:space="preserve">Recovery: </w:t>
+      </w:r>
+      <w:r>
+        <w:t>Trendanalyse über Tage, um Überlastung mehrere Tage früher zu erkennen</w:t>
+      </w:r>
+    </w:p>
+    <w:p>
+      <w:r>
+        <w:rPr>
+          <w:i w:val="0"/>
+          <w:color w:val="555F6E"/>
+          <w:sz w:val="20"/>
+        </w:rPr>
+        <w:t>Der Polar H10 ist ein etablierter Industriestandard mit hoher EKG-Genauigkeit und Bluetooth-Konnektivität – das reduziert Beschaffungs- und Wartungsaufwand erheblich.</w:t>
       </w:r>
     </w:p>
     <w:p>
       <w:pPr>
-        <w:jc w:val="both"/>
+        <w:pStyle w:val="Heading3"/>
+        <w:spacing w:before="160" w:after="40"/>
       </w:pPr>
       <w:r>
-        <w:t>Die Software ist das Wertschöpfungszentrum und der zentrale Differenzierungsfaktor. Während der direkte Wettbewerb vor allem Rohdaten- und Performance-Dashboards für sportwissenschaftliche Stäbe liefert, übersetzt BetterSquad die Daten in handlungsleitende Empfehlungen, die auch ohne Sportwissenschaftler:in vor Ort verständlich sind. Als Software-as-a-Service ist die Plattform für den Verein wartungsfrei und wird kontinuierlich weiterentwickelt. Sie besteht aus dem Trainer:innen-Dashboard, der Spieler:innen-App und der dahinterliegenden Analyse-Engine mit dem female-informed Decision Layer.</w:t>
+        <w:rPr>
+          <w:b/>
+          <w:color w:val="0E965A"/>
+          <w:sz w:val="24"/>
+        </w:rPr>
+        <w:t>3.2.3  Tracker-Dock &amp; QR-Checkout</w:t>
+      </w:r>
+    </w:p>
+    <w:p>
+      <w:r>
+        <w:rPr>
+          <w:i w:val="0"/>
+          <w:sz w:val="22"/>
+        </w:rPr>
+        <w:t>Die Geräte lagern und laden in einem zentralen Tracker-Dock. Vor dem Training scannt jede Spielerin über die App einen QR-Code am Dock und bekommt automatisch einen freien Tracker sowie einen Pulsgurt zugewiesen. Das löst zwei zentrale Praxisprobleme des Amateurbetriebs: Es macht eine feste 1:1-Zuordnung überflüssig (Voraussetzung des Pool-Modells) und stellt die korrekte, verwechslungsfreie Datenzuordnung sicher, ohne dass Personal Geräte manuell verteilen muss.</w:t>
       </w:r>
     </w:p>
     <w:p>
       <w:pPr>
-        <w:keepNext/>
-        <w:spacing w:before="160" w:after="80"/>
-        <w:jc w:val="both"/>
+        <w:pStyle w:val="ListBullet"/>
       </w:pPr>
       <w:r>
         <w:rPr>
           <w:b/>
+          <w:color w:val="0E965A"/>
         </w:rPr>
-        <w:t>Trainer:innen-Dashboard und Session Planner</w:t>
+        <w:t xml:space="preserve">Self-Checkout: </w:t>
+      </w:r>
+      <w:r>
+        <w:t>Automatische Zuweisung von Tracker- und Gurt-Nummer per QR-Scan</w:t>
       </w:r>
     </w:p>
     <w:p>
       <w:pPr>
-        <w:jc w:val="both"/>
+        <w:pStyle w:val="ListBullet"/>
       </w:pPr>
       <w:r>
-        <w:t>Das Web-Dashboard ist die Kommandozentrale für das Funktionsteam. Eine Squad-Ampel zeigt je Spielerin auf einen Blick den Status (Grün / Gelb / Rot), ergänzt um den Verlauf der durchschnittlichen und maximalen Team-ACWR über 21 Tage und Live-Kennzahlen zur Zahl fitter, gefährdeter und Risiko-Spielerinnen. Eine Detailansicht je Spielerin bündelt Last-, HRV- und Hooper-Historie; ein Equipment-Monitor zeigt den Pool-Status. Der integrierte Session Planner überführt die Analyse unmittelbar in die Trainingsplanung: Er stellt eine Kaderverfügbarkeits-Matrix mit ACWR, Hooper-Score, Status und empfohlener individueller Intensität (etwa „Pause“, „Leicht −20 %“ oder „Voll“) bereit und lässt sich als Sessionplan exportieren.</w:t>
+        <w:rPr>
+          <w:b/>
+          <w:color w:val="0E965A"/>
+        </w:rPr>
+        <w:t xml:space="preserve">Pool-Transparenz: </w:t>
+      </w:r>
+      <w:r>
+        <w:t>Live-Übersicht über verfügbare, ausgegebene und in Wartung befindliche Geräte</w:t>
       </w:r>
     </w:p>
     <w:p>
       <w:pPr>
-        <w:keepNext/>
-        <w:spacing w:before="160" w:after="80"/>
-        <w:jc w:val="both"/>
+        <w:pStyle w:val="ListBullet"/>
       </w:pPr>
       <w:r>
         <w:rPr>
           <w:b/>
+          <w:color w:val="0E965A"/>
         </w:rPr>
-        <w:t>Spieler:innen-App</w:t>
+        <w:t xml:space="preserve">Onboarding: </w:t>
+      </w:r>
+      <w:r>
+        <w:t>Geführte Schritt-für-Schritt-Anlage (Weste, Gurt befeuchten, Bluetooth prüfen)</w:t>
       </w:r>
     </w:p>
     <w:p>
       <w:pPr>
-        <w:jc w:val="both"/>
+        <w:pStyle w:val="Heading3"/>
+        <w:spacing w:before="160" w:after="40"/>
       </w:pPr>
       <w:r>
-        <w:t>Die mobile App bindet die Athletin aktiv in den Steuerungskreislauf ein. Sie zeigt eine tägliche Readiness-Karte mit persönlicher ACWR und Hooper-Score, ermöglicht den Wellness-Check-in über die vier Dimensionen Schlaf, Muskelkater, Energie und Stimmung, steuert den QR-Equipment-Checkout mit geführter Geräteanlage und stellt persönliche Statistiken zu Distanz, Sprints, Höchstgeschwindigkeit und HRV-Trend bereit. Über die App erfolgt zudem die freiwillige Eingabe der Zyklusinformation – ausschließlich durch die Spielerin selbst.</w:t>
+        <w:rPr>
+          <w:b/>
+          <w:color w:val="0E965A"/>
+          <w:sz w:val="24"/>
+        </w:rPr>
+        <w:t>3.2.4  Pool-Modell &amp; Pakete</w:t>
+      </w:r>
+    </w:p>
+    <w:p>
+      <w:r>
+        <w:rPr>
+          <w:i w:val="0"/>
+          <w:sz w:val="22"/>
+        </w:rPr>
+        <w:t>Eine Vereinslizenz deckt die gesamte Frauenabteilung ab; der Hardware-Umfang skaliert mit dem gewählten Paket:</w:t>
+      </w:r>
+    </w:p>
+    <w:tbl>
+      <w:tblPr>
+        <w:tblStyle w:val="LightGrid-Accent1"/>
+        <w:tblW w:type="auto" w:w="0"/>
+        <w:jc w:val="center"/>
+        <w:tblLook w:firstColumn="1" w:firstRow="1" w:lastColumn="0" w:lastRow="0" w:noHBand="0" w:noVBand="1" w:val="04A0"/>
+      </w:tblPr>
+      <w:tblGrid>
+        <w:gridCol w:w="1881"/>
+        <w:gridCol w:w="1881"/>
+        <w:gridCol w:w="1881"/>
+        <w:gridCol w:w="1881"/>
+        <w:gridCol w:w="1881"/>
+      </w:tblGrid>
+      <w:tr>
+        <w:tc>
+          <w:tcPr>
+            <w:tcW w:type="dxa" w:w="1881"/>
+            <w:shd w:val="clear" w:color="auto" w:fill="0E965A"/>
+          </w:tcPr>
+          <w:p>
+            <w:r/>
+            <w:r>
+              <w:rPr>
+                <w:b/>
+                <w:color w:val="FFFFFF"/>
+              </w:rPr>
+              <w:t>Paket</w:t>
+            </w:r>
+          </w:p>
+        </w:tc>
+        <w:tc>
+          <w:tcPr>
+            <w:tcW w:type="dxa" w:w="1881"/>
+            <w:shd w:val="clear" w:color="auto" w:fill="0E965A"/>
+          </w:tcPr>
+          <w:p>
+            <w:r/>
+            <w:r>
+              <w:rPr>
+                <w:b/>
+                <w:color w:val="FFFFFF"/>
+              </w:rPr>
+              <w:t>Preis / Monat</w:t>
+            </w:r>
+          </w:p>
+        </w:tc>
+        <w:tc>
+          <w:tcPr>
+            <w:tcW w:type="dxa" w:w="1881"/>
+            <w:shd w:val="clear" w:color="auto" w:fill="0E965A"/>
+          </w:tcPr>
+          <w:p>
+            <w:r/>
+            <w:r>
+              <w:rPr>
+                <w:b/>
+                <w:color w:val="FFFFFF"/>
+              </w:rPr>
+              <w:t>GPS-Tracker</w:t>
+            </w:r>
+          </w:p>
+        </w:tc>
+        <w:tc>
+          <w:tcPr>
+            <w:tcW w:type="dxa" w:w="1881"/>
+            <w:shd w:val="clear" w:color="auto" w:fill="0E965A"/>
+          </w:tcPr>
+          <w:p>
+            <w:r/>
+            <w:r>
+              <w:rPr>
+                <w:b/>
+                <w:color w:val="FFFFFF"/>
+              </w:rPr>
+              <w:t>Polar H10</w:t>
+            </w:r>
+          </w:p>
+        </w:tc>
+        <w:tc>
+          <w:tcPr>
+            <w:tcW w:type="dxa" w:w="1881"/>
+            <w:shd w:val="clear" w:color="auto" w:fill="0E965A"/>
+          </w:tcPr>
+          <w:p>
+            <w:r/>
+            <w:r>
+              <w:rPr>
+                <w:b/>
+                <w:color w:val="FFFFFF"/>
+              </w:rPr>
+              <w:t>Teams</w:t>
+            </w:r>
+          </w:p>
+        </w:tc>
+      </w:tr>
+      <w:tr>
+        <w:tc>
+          <w:tcPr>
+            <w:tcW w:type="dxa" w:w="1881"/>
+          </w:tcPr>
+          <w:p>
+            <w:r/>
+            <w:r>
+              <w:rPr>
+                <w:b/>
+              </w:rPr>
+              <w:t>Starter</w:t>
+            </w:r>
+          </w:p>
+        </w:tc>
+        <w:tc>
+          <w:tcPr>
+            <w:tcW w:type="dxa" w:w="1881"/>
+          </w:tcPr>
+          <w:p>
+            <w:r/>
+            <w:r>
+              <w:t>219 €</w:t>
+            </w:r>
+          </w:p>
+        </w:tc>
+        <w:tc>
+          <w:tcPr>
+            <w:tcW w:type="dxa" w:w="1881"/>
+          </w:tcPr>
+          <w:p>
+            <w:r/>
+            <w:r>
+              <w:t>15</w:t>
+            </w:r>
+          </w:p>
+        </w:tc>
+        <w:tc>
+          <w:tcPr>
+            <w:tcW w:type="dxa" w:w="1881"/>
+          </w:tcPr>
+          <w:p>
+            <w:r/>
+            <w:r>
+              <w:t>15</w:t>
+            </w:r>
+          </w:p>
+        </w:tc>
+        <w:tc>
+          <w:tcPr>
+            <w:tcW w:type="dxa" w:w="1881"/>
+          </w:tcPr>
+          <w:p>
+            <w:r/>
+            <w:r>
+              <w:t>bis zu 2</w:t>
+            </w:r>
+          </w:p>
+        </w:tc>
+      </w:tr>
+      <w:tr>
+        <w:tc>
+          <w:tcPr>
+            <w:tcW w:type="dxa" w:w="1881"/>
+          </w:tcPr>
+          <w:p>
+            <w:r/>
+            <w:r>
+              <w:rPr>
+                <w:b/>
+              </w:rPr>
+              <w:t>Pro</w:t>
+            </w:r>
+          </w:p>
+        </w:tc>
+        <w:tc>
+          <w:tcPr>
+            <w:tcW w:type="dxa" w:w="1881"/>
+          </w:tcPr>
+          <w:p>
+            <w:r/>
+            <w:r>
+              <w:t>349 €</w:t>
+            </w:r>
+          </w:p>
+        </w:tc>
+        <w:tc>
+          <w:tcPr>
+            <w:tcW w:type="dxa" w:w="1881"/>
+          </w:tcPr>
+          <w:p>
+            <w:r/>
+            <w:r>
+              <w:t>25</w:t>
+            </w:r>
+          </w:p>
+        </w:tc>
+        <w:tc>
+          <w:tcPr>
+            <w:tcW w:type="dxa" w:w="1881"/>
+          </w:tcPr>
+          <w:p>
+            <w:r/>
+            <w:r>
+              <w:t>25</w:t>
+            </w:r>
+          </w:p>
+        </w:tc>
+        <w:tc>
+          <w:tcPr>
+            <w:tcW w:type="dxa" w:w="1881"/>
+          </w:tcPr>
+          <w:p>
+            <w:r/>
+            <w:r>
+              <w:t>bis zu 4</w:t>
+            </w:r>
+          </w:p>
+        </w:tc>
+      </w:tr>
+      <w:tr>
+        <w:tc>
+          <w:tcPr>
+            <w:tcW w:type="dxa" w:w="1881"/>
+          </w:tcPr>
+          <w:p>
+            <w:r/>
+            <w:r>
+              <w:rPr>
+                <w:b/>
+              </w:rPr>
+              <w:t>Elite</w:t>
+            </w:r>
+          </w:p>
+        </w:tc>
+        <w:tc>
+          <w:tcPr>
+            <w:tcW w:type="dxa" w:w="1881"/>
+          </w:tcPr>
+          <w:p>
+            <w:r/>
+            <w:r>
+              <w:t>459 €</w:t>
+            </w:r>
+          </w:p>
+        </w:tc>
+        <w:tc>
+          <w:tcPr>
+            <w:tcW w:type="dxa" w:w="1881"/>
+          </w:tcPr>
+          <w:p>
+            <w:r/>
+            <w:r>
+              <w:t>35</w:t>
+            </w:r>
+          </w:p>
+        </w:tc>
+        <w:tc>
+          <w:tcPr>
+            <w:tcW w:type="dxa" w:w="1881"/>
+          </w:tcPr>
+          <w:p>
+            <w:r/>
+            <w:r>
+              <w:t>35</w:t>
+            </w:r>
+          </w:p>
+        </w:tc>
+        <w:tc>
+          <w:tcPr>
+            <w:tcW w:type="dxa" w:w="1881"/>
+          </w:tcPr>
+          <w:p>
+            <w:r/>
+            <w:r>
+              <w:t>unbegrenzt</w:t>
+            </w:r>
+          </w:p>
+        </w:tc>
+      </w:tr>
+    </w:tbl>
+    <w:p>
+      <w:r>
+        <w:rPr>
+          <w:i w:val="0"/>
+          <w:color w:val="555F6E"/>
+          <w:sz w:val="20"/>
+        </w:rPr>
+        <w:t>Zusätzlich sind Trageschutzwesten, Ersatzbänder (z. B. 48 Stück) sowie das Lade- und Checkout-Dock enthalten. Die Hardware wird über eine einmalige Anzahlung (2.200–4.200 €) und die laufende Lizenz finanziert; sie verbleibt im Nutzungsrecht der Abteilung. Die geteilte Nutzung ist nicht nur ein Preisvorteil, sondern erzeugt zugleich Wechselkosten: Konfiguration und individuelle Baselines der Spielerinnen entstehen über Monate und gingen bei einem Anbieterwechsel verloren.</w:t>
       </w:r>
     </w:p>
     <w:p>
       <w:pPr>
-        <w:keepNext/>
-        <w:spacing w:before="160" w:after="80"/>
-        <w:jc w:val="both"/>
+        <w:pStyle w:val="Heading2"/>
+        <w:spacing w:before="240" w:after="80"/>
       </w:pPr>
       <w:r>
         <w:rPr>
           <w:b/>
+          <w:color w:val="0A0F1A"/>
+          <w:sz w:val="28"/>
         </w:rPr>
-        <w:t>Female-informed Decision Layer</w:t>
+        <w:t>3.3  Software: Decision Layer statt Rohdaten-Dashboard</w:t>
+      </w:r>
+    </w:p>
+    <w:p>
+      <w:r>
+        <w:rPr>
+          <w:i w:val="0"/>
+          <w:sz w:val="22"/>
+        </w:rPr>
+        <w:t>Die Software ist das Wertschöpfungszentrum und der zentrale Differenzierungsfaktor. Während der direkte Wettbewerb vor allem Rohdaten- und Performance-Dashboards für sportwissenschaftliche Stäbe liefert, übersetzt BetterSquad die Daten in handlungsleitende Empfehlungen, die auch ohne Sportwissenschaftler:in vor Ort verständlich sind. Als Software-as-a-Service ist die Plattform für den Verein wartungsfrei und wird kontinuierlich weiterentwickelt.</w:t>
       </w:r>
     </w:p>
     <w:p>
       <w:pPr>
-        <w:jc w:val="both"/>
+        <w:pStyle w:val="Heading3"/>
+        <w:spacing w:before="160" w:after="40"/>
       </w:pPr>
       <w:r>
-        <w:t>Der Decision Layer ist das eigentliche Alleinstellungsmerkmal der Software. Die Analyse-Engine verarbeitet äußere Last, innere Last und subjektives Befinden zu einer priorisierten, individuellen Empfehlung. Grundlage ist die Acute:Chronic Workload Ratio aus 7-Tage-Akut- und 28-Tage-Chroniklast (Schwellen: über 1,3 erhöht, über 1,49 kritisch), eingebettet in eine individuelle Baseline jeder Spielerin – nicht in aus Männermessungen abgeleitete Referenzwerte. Genau diese individuelle, auf weibliche Physiologie kalibrierte Auswertung fehlt sowohl beim direkten als auch beim indirekten Wettbewerb.</w:t>
+        <w:rPr>
+          <w:b/>
+          <w:color w:val="0E965A"/>
+          <w:sz w:val="24"/>
+        </w:rPr>
+        <w:t>3.3.1  Trainer:innen-Dashboard &amp; Session Planner</w:t>
+      </w:r>
+    </w:p>
+    <w:p>
+      <w:r>
+        <w:rPr>
+          <w:i w:val="0"/>
+          <w:sz w:val="22"/>
+        </w:rPr>
+        <w:t>Das Web-Dashboard ist die Kommandozentrale für das Funktionsteam:</w:t>
       </w:r>
     </w:p>
     <w:p>
       <w:pPr>
-        <w:jc w:val="both"/>
+        <w:pStyle w:val="ListBullet"/>
       </w:pPr>
       <w:r>
-        <w:t>Die freiwillige Zyklusangabe fließt dabei als ein Faktor unter mehreren in den individuellen Score ein und kontextualisiert insbesondere die Interpretation der HRV-Werte. Das Ergebnis ist für die Trainer:innen eine verständliche Ampel mit Begründungstext und einer konkreten Handlungsempfehlung je Spielerin und für das Gesamtteam (etwa „Intensität um 20 % reduzieren, Fokus Taktik und Regeneration“). Damit ersetzt die Software die Interpretationsleistung, die im Profibereich teures Fachpersonal erbringt.</w:t>
+        <w:rPr>
+          <w:b/>
+          <w:color w:val="0E965A"/>
+        </w:rPr>
+        <w:t xml:space="preserve">Squad-Ampel: </w:t>
+      </w:r>
+      <w:r>
+        <w:t>Squad-Ampel mit Grün/Gelb/Rot-Status je Spielerin auf einen Blick</w:t>
       </w:r>
     </w:p>
     <w:p>
       <w:pPr>
-        <w:keepNext/>
-        <w:spacing w:before="280" w:after="80"/>
-        <w:jc w:val="both"/>
+        <w:pStyle w:val="ListBullet"/>
       </w:pPr>
       <w:r>
         <w:rPr>
           <w:b/>
+          <w:color w:val="0E965A"/>
         </w:rPr>
-        <w:t>Datenschutz-Architektur: ein Belastungs-Tool mit Zykluskontext, keine Zyklus-App</w:t>
+        <w:t xml:space="preserve">ACWR-Chart: </w:t>
+      </w:r>
+      <w:r>
+        <w:t>Verlauf der durchschnittlichen und maximalen Team-ACWR über 21 Tage</w:t>
       </w:r>
     </w:p>
     <w:p>
       <w:pPr>
-        <w:jc w:val="both"/>
+        <w:pStyle w:val="ListBullet"/>
       </w:pPr>
       <w:r>
-        <w:t>Da BetterSquad besondere Kategorien personenbezogener Daten im Sinne des Art. 9 DSGVO (Gesundheitsdaten) verarbeitet, ist Datenschutz integraler Produktbestandteil und zugleich vertrieblicher Wettbewerbsvorteil. Die gesamte Verarbeitung erfolgt DSGVO-konform mit Serverstandort in Deutschland, verschlüsselter Übertragung und rollenbasiert getrennten Zugriffen für Trainer:innen und Spielerinnen.</w:t>
+        <w:rPr>
+          <w:b/>
+          <w:color w:val="0E965A"/>
+        </w:rPr>
+        <w:t xml:space="preserve">KPI-Board: </w:t>
+      </w:r>
+      <w:r>
+        <w:t>Live-KPIs zur Zahl fitter, gefährdeter und Risiko-Spielerinnen</w:t>
       </w:r>
     </w:p>
     <w:p>
       <w:pPr>
-        <w:jc w:val="both"/>
+        <w:pStyle w:val="ListBullet"/>
       </w:pPr>
       <w:r>
-        <w:t>Entscheidend ist die bewusst gegenläufige Architektur gegenüber zyklusbasierten Software-Plattformen, die Trainer:innen bei Einwilligung weitreichende Einsicht in Zyklusphase und Symptomhistorie der Athletinnen gewähren. Bei BetterSquad ist die freiwillige Zyklusangabe ausschließlich ein interner Score-Faktor der Spielerin und zu keinem Zeitpunkt für Trainer:innen sichtbar; diese sehen ausschließlich Ampel und Begründungstext. BetterSquad ist damit ausdrücklich keine Zyklus-App, sondern ein Belastungs-Tool mit Zykluskontext. Diese Trennung ist datenschutzrechtlich (Art. 9 DSGVO), akzeptanzpsychologisch (überwiegend männlicher Trainerstab im Amateurfußball) und positionierungsstrategisch ein wesentlicher Unterschied – und schützt zugleich die individuelle Baseline als zentralen Werttreiber.</w:t>
+        <w:rPr>
+          <w:b/>
+          <w:color w:val="0E965A"/>
+        </w:rPr>
+        <w:t xml:space="preserve">Spielerin-Detail: </w:t>
+      </w:r>
+      <w:r>
+        <w:t>Detailansicht je Spielerin mit Last-, HRV- und Hooper-Historie</w:t>
       </w:r>
     </w:p>
     <w:p>
       <w:pPr>
-        <w:keepNext/>
-        <w:spacing w:before="280" w:after="80"/>
-        <w:jc w:val="both"/>
+        <w:pStyle w:val="ListBullet"/>
       </w:pPr>
       <w:r>
         <w:rPr>
           <w:b/>
+          <w:color w:val="0E965A"/>
         </w:rPr>
-        <w:t>Wissenschaftliche Fundierung</w:t>
+        <w:t xml:space="preserve">Session Planner: </w:t>
+      </w:r>
+      <w:r>
+        <w:t>Kaderverfügbarkeits-Matrix mit empfohlener individueller Intensität, exportierbar als Sessionplan</w:t>
       </w:r>
     </w:p>
     <w:p>
       <w:pPr>
-        <w:jc w:val="both"/>
+        <w:pStyle w:val="Heading3"/>
+        <w:spacing w:before="160" w:after="40"/>
       </w:pPr>
       <w:r>
-        <w:t>Alle Kennzahlen des Systems beruhen auf etablierten sportwissenschaftlichen Methoden; das grenzt BetterSquad von rein technikgetriebenen Tracking-Gadgets ab und schafft Glaubwürdigkeit gegenüber Vereinen und Verbänden. Die Belastungssteuerung folgt dem von Gabbett (2016) validierten ACWR-Modell zur Verletzungsprävention. Der Wellness-Check-in basiert auf der nach Saw et al. (2016) bestätigten Aussagekraft subjektiver Selbstauskünfte (Hooper-Index). Die HRV-gestützte Recovery-Analyse stützt sich auf Befunde zur Trainingsadaptation und Herzfrequenzvariabilität (Plews et al., 2013), und die geschlechtsspezifische Kalibrierung trägt der Evidenz zum Einfluss des Menstruationszyklus auf die Leistungsfähigkeit Rechnung (McNulty et al., 2020).</w:t>
+        <w:rPr>
+          <w:b/>
+          <w:color w:val="0E965A"/>
+          <w:sz w:val="24"/>
+        </w:rPr>
+        <w:t>3.3.2  Spieler:innen-App</w:t>
+      </w:r>
+    </w:p>
+    <w:p>
+      <w:r>
+        <w:rPr>
+          <w:i w:val="0"/>
+          <w:sz w:val="22"/>
+        </w:rPr>
+        <w:t>Die mobile App bindet die Athletin aktiv in den Steuerungskreislauf ein:</w:t>
       </w:r>
     </w:p>
     <w:p>
       <w:pPr>
-        <w:keepNext/>
-        <w:spacing w:before="280" w:after="80"/>
-        <w:jc w:val="both"/>
+        <w:pStyle w:val="ListBullet"/>
       </w:pPr>
       <w:r>
         <w:rPr>
           <w:b/>
+          <w:color w:val="0E965A"/>
         </w:rPr>
-        <w:t>Kundennutzen und Alleinstellung</w:t>
+        <w:t xml:space="preserve">Readiness: </w:t>
+      </w:r>
+      <w:r>
+        <w:t>Tägliche Readiness-Karte mit persönlicher ACWR und Hooper-Score</w:t>
       </w:r>
     </w:p>
     <w:p>
       <w:pPr>
-        <w:jc w:val="both"/>
+        <w:pStyle w:val="ListBullet"/>
       </w:pPr>
       <w:r>
-        <w:t>Der Kundennutzen ergibt sich aus dem Zusammenspiel der Bausteine und lässt sich entlang weniger struktureller Vorteile zusammenfassen:</w:t>
+        <w:rPr>
+          <w:b/>
+          <w:color w:val="0E965A"/>
+        </w:rPr>
+        <w:t xml:space="preserve">Check-in: </w:t>
+      </w:r>
+      <w:r>
+        <w:t>Wellness-Check-in über Schlaf, Muskelkater, Energie und Stimmung</w:t>
       </w:r>
     </w:p>
     <w:p>
       <w:pPr>
-        <w:pStyle w:val="ListParagraph"/>
-        <w:jc w:val="both"/>
+        <w:pStyle w:val="ListBullet"/>
       </w:pPr>
       <w:r>
         <w:rPr>
           <w:b/>
+          <w:color w:val="0E965A"/>
         </w:rPr>
-        <w:t>Integration statt Insellösungen</w:t>
-        <w:br/>
+        <w:t xml:space="preserve">Scan: </w:t>
       </w:r>
       <w:r>
-        <w:t>Äußere und innere Last sowie subjektives Befinden laufen in einer Plattform zusammen, statt auf getrennte Hardware-, Performance- und Wellness-Tools verteilt zu sein.</w:t>
+        <w:t>QR-Equipment-Checkout mit geführter Geräteanlage</w:t>
       </w:r>
     </w:p>
     <w:p>
       <w:pPr>
-        <w:pStyle w:val="ListParagraph"/>
-        <w:jc w:val="both"/>
+        <w:pStyle w:val="ListBullet"/>
       </w:pPr>
       <w:r>
         <w:rPr>
           <w:b/>
+          <w:color w:val="0E965A"/>
         </w:rPr>
-        <w:t>Bezahlbarkeit durch das Pool-Modell</w:t>
-        <w:br/>
+        <w:t xml:space="preserve">Stats: </w:t>
       </w:r>
       <w:r>
-        <w:t>Eine Vereinslizenz und ein geteilter Gerätepool decken die gesamte Frauenabteilung ab; die Pro-Gerät- bzw. Pro-Spieler:in-Logik des Wettbewerbs entfällt.</w:t>
+        <w:t>Persönliche Statistiken: Distanz, Sprints, Höchstgeschwindigkeit, HRV-Trend</w:t>
       </w:r>
     </w:p>
     <w:p>
       <w:pPr>
-        <w:pStyle w:val="ListParagraph"/>
-        <w:jc w:val="both"/>
+        <w:pStyle w:val="ListBullet"/>
       </w:pPr>
       <w:r>
         <w:rPr>
           <w:b/>
+          <w:color w:val="0E965A"/>
         </w:rPr>
-        <w:t>Female-informed Decision Layer</w:t>
-        <w:br/>
+        <w:t xml:space="preserve">Zyklus (optional): </w:t>
       </w:r>
       <w:r>
-        <w:t>Individuelle, auf weibliche Physiologie kalibrierte Baselines statt aus Männermessungen abgeleiteter Referenzwerte – mit Zyklusangabe als kontextualisierendem Score-Faktor.</w:t>
+        <w:t>Freiwillige Zyklusangabe – ausschließlich durch die Spielerin selbst</w:t>
       </w:r>
     </w:p>
     <w:p>
       <w:pPr>
-        <w:pStyle w:val="ListParagraph"/>
-        <w:jc w:val="both"/>
+        <w:pStyle w:val="Heading3"/>
+        <w:spacing w:before="160" w:after="40"/>
       </w:pPr>
       <w:r>
         <w:rPr>
           <w:b/>
+          <w:color w:val="0E965A"/>
+          <w:sz w:val="24"/>
         </w:rPr>
-        <w:t>Entscheidungsunterstützung statt Rohdaten</w:t>
-        <w:br/>
+        <w:t>3.3.3  Female-informed Decision Layer</w:t>
       </w:r>
+    </w:p>
+    <w:p>
       <w:r>
-        <w:t>Ampel-Logik und Klartext-Empfehlungen machen das System ohne Sportwissenschaftler:in vor Ort bedienbar.</w:t>
+        <w:rPr>
+          <w:i w:val="0"/>
+          <w:sz w:val="22"/>
+        </w:rPr>
+        <w:t>Der Decision Layer ist das eigentliche Alleinstellungsmerkmal der Software. Die Analyse-Engine verarbeitet äußere Last, innere Last und subjektives Befinden zu einer priorisierten, individuellen Empfehlung:</w:t>
       </w:r>
     </w:p>
     <w:p>
       <w:pPr>
-        <w:pStyle w:val="ListParagraph"/>
-        <w:jc w:val="both"/>
+        <w:pStyle w:val="ListBullet"/>
       </w:pPr>
       <w:r>
         <w:rPr>
           <w:b/>
+          <w:color w:val="0E965A"/>
         </w:rPr>
-        <w:t>Datenschutz als Vertrauensvorteil</w:t>
-        <w:br/>
+        <w:t xml:space="preserve">ACWR-Berechnung: </w:t>
       </w:r>
       <w:r>
-        <w:t>DSGVO-konform, Serverstandort Deutschland und eine Architektur, die Zyklusdaten konsequent vor dem Trainerstab verbirgt.</w:t>
+        <w:t>Acute:Chronic Workload Ratio aus 7-Tage-Akut- und 28-Tage-Chroniklast; Schwellen: &gt; 1,3 erhöht (Gelb), &gt; 1,49 kritisch (Rot).</w:t>
       </w:r>
     </w:p>
     <w:p>
       <w:pPr>
-        <w:keepNext/>
-        <w:spacing w:before="280" w:after="80"/>
-        <w:jc w:val="both"/>
+        <w:pStyle w:val="ListBullet"/>
       </w:pPr>
       <w:r>
         <w:rPr>
           <w:b/>
+          <w:color w:val="0E965A"/>
         </w:rPr>
-        <w:t>Entwicklungsstand und Roadmap</w:t>
+        <w:t xml:space="preserve">Individuelle Baseline: </w:t>
+      </w:r>
+      <w:r>
+        <w:t>Auswertung gegen eine individuelle, auf weibliche Physiologie kalibrierte Baseline jeder Spielerin – nicht gegen aus Männermessungen abgeleitete Referenzwerte.</w:t>
       </w:r>
     </w:p>
     <w:p>
       <w:pPr>
-        <w:jc w:val="both"/>
+        <w:pStyle w:val="ListBullet"/>
       </w:pPr>
       <w:r>
-        <w:t>Der funktionsfähige Frontend-Prototyp aus Trainer:innen-Dashboard und Spieler:innen-App bildet den vollständigen Nutzungsablauf bereits ab und dient als Grundlage für Pilotvereine und Pitch. In Phase 1 folgen die Hardware-Anbindung (Live-Datenstrom aus GPS und Polar H10), das Cloud-Backend sowie ein Pilotbetrieb in einer bis zwei Frauenabteilungen. Phase 2 schärft den Decision Layer auf realen Saisondaten, ergänzt Reporting-Export und Verbandsschnittstellen. Phase 3 skaliert über die DACH-Landesverbände auf rund 85 Vereine bis Jahr 3.</w:t>
+        <w:rPr>
+          <w:b/>
+          <w:color w:val="0E965A"/>
+        </w:rPr>
+        <w:t xml:space="preserve">Zykluskontext: </w:t>
+      </w:r>
+      <w:r>
+        <w:t>Die freiwillige Zyklusangabe fließt als ein Faktor unter mehreren in den Score ein und kontextualisiert insbesondere die HRV-Interpretation.</w:t>
       </w:r>
     </w:p>
     <w:p>
       <w:pPr>
-        <w:keepNext/>
-        <w:spacing w:before="280" w:after="80"/>
-        <w:jc w:val="both"/>
+        <w:pStyle w:val="ListBullet"/>
       </w:pPr>
       <w:r>
         <w:rPr>
           <w:b/>
+          <w:color w:val="0E965A"/>
         </w:rPr>
-        <w:t>Literaturverzeichnis</w:t>
+        <w:t xml:space="preserve">Klartext-Empfehlung: </w:t>
+      </w:r>
+      <w:r>
+        <w:t>Verständliche Ampel mit Begründungstext und konkreter Handlungsempfehlung je Spielerin und fürs Gesamtteam.</w:t>
+      </w:r>
+    </w:p>
+    <w:tbl>
+      <w:tblPr>
+        <w:tblW w:type="auto" w:w="0"/>
+        <w:jc w:val="center"/>
+        <w:tblLook w:firstColumn="1" w:firstRow="1" w:lastColumn="0" w:lastRow="0" w:noHBand="0" w:noVBand="1" w:val="04A0"/>
+      </w:tblPr>
+      <w:tblGrid>
+        <w:gridCol w:w="9406"/>
+      </w:tblGrid>
+      <w:tr>
+        <w:tc>
+          <w:tcPr>
+            <w:tcW w:type="dxa" w:w="9406"/>
+            <w:shd w:val="clear" w:color="auto" w:fill="ECFDF5"/>
+          </w:tcPr>
+          <w:p>
+            <w:r/>
+            <w:r>
+              <w:rPr>
+                <w:b/>
+                <w:color w:val="0E965A"/>
+                <w:sz w:val="22"/>
+              </w:rPr>
+              <w:t>Kundennutzen der Software</w:t>
+            </w:r>
+          </w:p>
+          <w:p>
+            <w:r>
+              <w:rPr>
+                <w:sz w:val="21"/>
+              </w:rPr>
+              <w:t>Aus Zahlen werden Entscheidungen: Die Plattform sagt nicht nur, dass eine Spielerin gefährdet ist, sondern auch, was zu tun ist – z. B. „Intensität um 20 % reduzieren, Fokus Taktik + Regeneration“. Das ersetzt die Interpretationsleistung, die im Profibereich teures Fachpersonal erbringt.</w:t>
+            </w:r>
+          </w:p>
+        </w:tc>
+      </w:tr>
+    </w:tbl>
+    <w:p>
+      <w:pPr>
+        <w:pStyle w:val="Heading2"/>
+        <w:spacing w:before="240" w:after="80"/>
+      </w:pPr>
+      <w:r>
+        <w:rPr>
+          <w:b/>
+          <w:color w:val="0A0F1A"/>
+          <w:sz w:val="28"/>
+        </w:rPr>
+        <w:t>3.4  Datenschutz-Architektur: keine Zyklus-App, sondern ein Belastungs-Tool mit Zykluskontext</w:t>
+      </w:r>
+    </w:p>
+    <w:p>
+      <w:r>
+        <w:rPr>
+          <w:i w:val="0"/>
+          <w:sz w:val="22"/>
+        </w:rPr>
+        <w:t>Da BetterSquad besondere Kategorien personenbezogener Daten im Sinne des Art. 9 DSGVO (Gesundheitsdaten) verarbeitet, ist Datenschutz integraler Produktbestandteil und zugleich vertrieblicher Wettbewerbsvorteil. Die gesamte Verarbeitung erfolgt DSGVO-konform mit Serverstandort in Deutschland, verschlüsselter Übertragung und rollenbasiert getrennten Zugriffen.</w:t>
+      </w:r>
+    </w:p>
+    <w:p>
+      <w:r>
+        <w:rPr>
+          <w:i w:val="0"/>
+          <w:sz w:val="22"/>
+        </w:rPr>
+        <w:t>Entscheidend ist die bewusst gegenläufige Architektur gegenüber zyklusbasierten Software-Plattformen, die Trainer:innen bei Einwilligung weitreichende Einsicht in Zyklusphase und Symptomhistorie gewähren. Bei BetterSquad ist die freiwillige Zyklusangabe ausschließlich ein interner Score-Faktor der Spielerin und zu keinem Zeitpunkt für Trainer:innen sichtbar – diese sehen nur Ampel und Begründungstext. BetterSquad ist damit ausdrücklich keine Zyklus-App, sondern ein Belastungs-Tool mit Zykluskontext.</w:t>
+      </w:r>
+    </w:p>
+    <w:p>
+      <w:pPr>
+        <w:pStyle w:val="ListBullet"/>
+      </w:pPr>
+      <w:r>
+        <w:rPr>
+          <w:b/>
+          <w:color w:val="0E965A"/>
+        </w:rPr>
+        <w:t xml:space="preserve">Privacy by Design: </w:t>
+      </w:r>
+      <w:r>
+        <w:t>Zyklusangabe freiwillig, nur durch die Spielerin, niemals als Coach-Information</w:t>
+      </w:r>
+    </w:p>
+    <w:p>
+      <w:pPr>
+        <w:pStyle w:val="ListBullet"/>
+      </w:pPr>
+      <w:r>
+        <w:rPr>
+          <w:b/>
+          <w:color w:val="0E965A"/>
+        </w:rPr>
+        <w:t xml:space="preserve">Akzeptanz: </w:t>
+      </w:r>
+      <w:r>
+        <w:t>Akzeptanz im überwiegend männlichen Trainerstab des Amateurfußballs</w:t>
+      </w:r>
+    </w:p>
+    <w:p>
+      <w:pPr>
+        <w:pStyle w:val="ListBullet"/>
+      </w:pPr>
+      <w:r>
+        <w:rPr>
+          <w:b/>
+          <w:color w:val="0E965A"/>
+        </w:rPr>
+        <w:t xml:space="preserve">Compliance: </w:t>
+      </w:r>
+      <w:r>
+        <w:t>Serverstandort Deutschland, Art. 9 DSGVO, verschlüsselte Übertragung</w:t>
+      </w:r>
+    </w:p>
+    <w:p>
+      <w:pPr>
+        <w:pStyle w:val="Heading2"/>
+        <w:spacing w:before="240" w:after="80"/>
+      </w:pPr>
+      <w:r>
+        <w:rPr>
+          <w:b/>
+          <w:color w:val="0A0F1A"/>
+          <w:sz w:val="28"/>
+        </w:rPr>
+        <w:t>3.5  Wissenschaftliche Fundierung</w:t>
+      </w:r>
+    </w:p>
+    <w:p>
+      <w:r>
+        <w:rPr>
+          <w:i w:val="0"/>
+          <w:sz w:val="22"/>
+        </w:rPr>
+        <w:t>Alle Kennzahlen des Systems beruhen auf etablierten sportwissenschaftlichen Methoden. Das grenzt BetterSquad von rein technikgetriebenen Tracking-Gadgets ab und schafft Glaubwürdigkeit gegenüber Vereinen und Verbänden:</w:t>
+      </w:r>
+    </w:p>
+    <w:p>
+      <w:pPr>
+        <w:pStyle w:val="ListBullet"/>
+      </w:pPr>
+      <w:r>
+        <w:rPr>
+          <w:b/>
+          <w:color w:val="0E965A"/>
+        </w:rPr>
+        <w:t xml:space="preserve">Gabbett (2016): </w:t>
+      </w:r>
+      <w:r>
+        <w:t>ACWR-Belastungssteuerung nach Gabbett (2016) als validiertes Modell zur Verletzungsprävention.</w:t>
+      </w:r>
+    </w:p>
+    <w:p>
+      <w:pPr>
+        <w:pStyle w:val="ListBullet"/>
+      </w:pPr>
+      <w:r>
+        <w:rPr>
+          <w:b/>
+          <w:color w:val="0E965A"/>
+        </w:rPr>
+        <w:t xml:space="preserve">Saw et al. (2016): </w:t>
+      </w:r>
+      <w:r>
+        <w:t>Wellness-Check-in nach der von Saw et al. (2016) bestätigten Aussagekraft subjektiver Selbstauskünfte (Hooper-Index).</w:t>
+      </w:r>
+    </w:p>
+    <w:p>
+      <w:pPr>
+        <w:pStyle w:val="ListBullet"/>
+      </w:pPr>
+      <w:r>
+        <w:rPr>
+          <w:b/>
+          <w:color w:val="0E965A"/>
+        </w:rPr>
+        <w:t xml:space="preserve">Plews et al. (2013): </w:t>
+      </w:r>
+      <w:r>
+        <w:t>HRV als anerkannter Marker für Trainingsadaptation und Regeneration (Plews et al., 2013).</w:t>
+      </w:r>
+    </w:p>
+    <w:p>
+      <w:pPr>
+        <w:pStyle w:val="ListBullet"/>
+      </w:pPr>
+      <w:r>
+        <w:rPr>
+          <w:b/>
+          <w:color w:val="0E965A"/>
+        </w:rPr>
+        <w:t xml:space="preserve">McNulty et al. (2020): </w:t>
+      </w:r>
+      <w:r>
+        <w:t>Geschlechtsspezifische Kalibrierung auf Basis der Evidenz zum Zyklus­einfluss auf die Leistungsfähigkeit (McNulty et al., 2020).</w:t>
+      </w:r>
+    </w:p>
+    <w:p>
+      <w:pPr>
+        <w:pStyle w:val="Heading2"/>
+        <w:spacing w:before="240" w:after="80"/>
+      </w:pPr>
+      <w:r>
+        <w:rPr>
+          <w:b/>
+          <w:color w:val="0A0F1A"/>
+          <w:sz w:val="28"/>
+        </w:rPr>
+        <w:t>3.6  Kundennutzen &amp; Alleinstellung</w:t>
+      </w:r>
+    </w:p>
+    <w:p>
+      <w:r>
+        <w:rPr>
+          <w:i w:val="0"/>
+          <w:sz w:val="22"/>
+        </w:rPr>
+        <w:t>Der Kundennutzen ergibt sich aus dem Zusammenspiel der Bausteine:</w:t>
+      </w:r>
+    </w:p>
+    <w:p>
+      <w:pPr>
+        <w:pStyle w:val="ListBullet"/>
+      </w:pPr>
+      <w:r>
+        <w:rPr>
+          <w:b/>
+          <w:color w:val="0E965A"/>
+        </w:rPr>
+        <w:t xml:space="preserve">Integration: </w:t>
+      </w:r>
+      <w:r>
+        <w:t>Äußere und innere Last sowie subjektives Befinden in einer Plattform statt getrennter Insellösungen.</w:t>
+      </w:r>
+    </w:p>
+    <w:p>
+      <w:pPr>
+        <w:pStyle w:val="ListBullet"/>
+      </w:pPr>
+      <w:r>
+        <w:rPr>
+          <w:b/>
+          <w:color w:val="0E965A"/>
+        </w:rPr>
+        <w:t xml:space="preserve">Pool-Modell: </w:t>
+      </w:r>
+      <w:r>
+        <w:t>Eine Vereinslizenz und ein geteilter Gerätepool für die gesamte Frauenabteilung statt Pro-Gerät-Logik.</w:t>
+      </w:r>
+    </w:p>
+    <w:p>
+      <w:pPr>
+        <w:pStyle w:val="ListBullet"/>
+      </w:pPr>
+      <w:r>
+        <w:rPr>
+          <w:b/>
+          <w:color w:val="0E965A"/>
+        </w:rPr>
+        <w:t xml:space="preserve">Female-informed: </w:t>
+      </w:r>
+      <w:r>
+        <w:t>Individuelle, auf weibliche Physiologie kalibrierte Baselines mit Zyklusangabe als Score-Faktor.</w:t>
+      </w:r>
+    </w:p>
+    <w:p>
+      <w:pPr>
+        <w:pStyle w:val="ListBullet"/>
+      </w:pPr>
+      <w:r>
+        <w:rPr>
+          <w:b/>
+          <w:color w:val="0E965A"/>
+        </w:rPr>
+        <w:t xml:space="preserve">Einfachheit: </w:t>
+      </w:r>
+      <w:r>
+        <w:t>Ampel-Logik und Klartext-Empfehlungen – bedienbar ohne Sportwissenschaftler:in vor Ort.</w:t>
+      </w:r>
+    </w:p>
+    <w:p>
+      <w:pPr>
+        <w:pStyle w:val="ListBullet"/>
+      </w:pPr>
+      <w:r>
+        <w:rPr>
+          <w:b/>
+          <w:color w:val="0E965A"/>
+        </w:rPr>
+        <w:t xml:space="preserve">Datenschutz: </w:t>
+      </w:r>
+      <w:r>
+        <w:t>DSGVO-konform, Serverstandort Deutschland, Zyklusdaten konsequent vor dem Trainerstab verborgen.</w:t>
+      </w:r>
+    </w:p>
+    <w:p>
+      <w:pPr>
+        <w:pStyle w:val="Heading2"/>
+        <w:spacing w:before="240" w:after="80"/>
+      </w:pPr>
+      <w:r>
+        <w:rPr>
+          <w:b/>
+          <w:color w:val="0A0F1A"/>
+          <w:sz w:val="28"/>
+        </w:rPr>
+        <w:t>3.7  Entwicklungsstand &amp; Roadmap</w:t>
+      </w:r>
+    </w:p>
+    <w:p>
+      <w:r>
+        <w:rPr>
+          <w:i w:val="0"/>
+          <w:sz w:val="22"/>
+        </w:rPr>
+        <w:t>Der funktionsfähige Frontend-Prototyp aus Trainer:innen-Dashboard und Spieler:innen-App bildet den vollständigen Nutzungsablauf bereits ab und dient als Grundlage für Pilotvereine und Pitch.</w:t>
+      </w:r>
+    </w:p>
+    <w:p>
+      <w:pPr>
+        <w:pStyle w:val="ListBullet"/>
+      </w:pPr>
+      <w:r>
+        <w:rPr>
+          <w:b/>
+          <w:color w:val="0E965A"/>
+        </w:rPr>
+        <w:t xml:space="preserve">Status quo: </w:t>
+      </w:r>
+      <w:r>
+        <w:t>Validierter, klickbarer Prototyp des End-to-End-Nutzungsflusses.</w:t>
+      </w:r>
+    </w:p>
+    <w:p>
+      <w:pPr>
+        <w:pStyle w:val="ListBullet"/>
+      </w:pPr>
+      <w:r>
+        <w:rPr>
+          <w:b/>
+          <w:color w:val="0E965A"/>
+        </w:rPr>
+        <w:t xml:space="preserve">Phase 1: </w:t>
+      </w:r>
+      <w:r>
+        <w:t>Hardware-Anbindung (Live-Daten GPS + Polar H10), Cloud-Backend, Pilot in 1–2 Frauenabteilungen.</w:t>
+      </w:r>
+    </w:p>
+    <w:p>
+      <w:pPr>
+        <w:pStyle w:val="ListBullet"/>
+      </w:pPr>
+      <w:r>
+        <w:rPr>
+          <w:b/>
+          <w:color w:val="0E965A"/>
+        </w:rPr>
+        <w:t xml:space="preserve">Phase 2: </w:t>
+      </w:r>
+      <w:r>
+        <w:t>Schärfung des Decision Layers auf realen Saisondaten, Reporting-Export, Verbandsschnittstellen.</w:t>
+      </w:r>
+    </w:p>
+    <w:p>
+      <w:pPr>
+        <w:pStyle w:val="ListBullet"/>
+      </w:pPr>
+      <w:r>
+        <w:rPr>
+          <w:b/>
+          <w:color w:val="0E965A"/>
+        </w:rPr>
+        <w:t xml:space="preserve">Phase 3: </w:t>
+      </w:r>
+      <w:r>
+        <w:t>Skalierung über die DACH-Landesverbände auf rund 85 Vereine bis Jahr 3.</w:t>
+      </w:r>
+    </w:p>
+    <w:p>
+      <w:pPr>
+        <w:pStyle w:val="Heading2"/>
+        <w:spacing w:before="240" w:after="80"/>
+      </w:pPr>
+      <w:r>
+        <w:rPr>
+          <w:b/>
+          <w:color w:val="0A0F1A"/>
+          <w:sz w:val="28"/>
+        </w:rPr>
+        <w:t>3.8  Literaturverzeichnis</w:t>
       </w:r>
     </w:p>
     <w:p>
@@ -514,9 +1490,20 @@
         <w:t>Saw, A. E., Main, L. C., &amp; Gastin, P. B. (2016). Monitoring the athlete training response: Subjective self-reported measures trump commonly used objective measures – A systematic review. British Journal of Sports Medicine, 50(5), 281–291. https://doi.org/10.1136/bjsports-2015-094758</w:t>
       </w:r>
     </w:p>
+    <w:p/>
+    <w:p>
+      <w:r>
+        <w:rPr>
+          <w:i/>
+          <w:color w:val="555F6E"/>
+          <w:sz w:val="18"/>
+        </w:rPr>
+        <w:t>BetterSquad · Businessplan Teil 3: Produkt / Dienstleistung</w:t>
+      </w:r>
+    </w:p>
     <w:sectPr>
       <w:pgSz w:w="12240" w:h="15840"/>
-      <w:pgMar w:top="1417" w:right="1417" w:bottom="1417" w:left="1417" w:header="720" w:footer="720" w:gutter="0"/>
+      <w:pgMar w:top="1247" w:right="1417" w:bottom="1247" w:left="1417" w:header="720" w:footer="720" w:gutter="0"/>
       <w:cols w:space="720"/>
       <w:docGrid w:linePitch="360"/>
     </w:sectPr>
@@ -888,7 +1875,7 @@
     <w:qFormat/>
     <w:rsid w:val="00FC693F"/>
     <w:pPr>
-      <w:spacing w:after="160" w:line="259" w:lineRule="auto"/>
+      <w:spacing w:after="120" w:line="300" w:lineRule="auto"/>
     </w:pPr>
     <w:rPr>
       <w:rFonts w:ascii="Calibri" w:hAnsi="Calibri"/>

</xml_diff>